<commit_message>
Usa textos de Machado de Assis e um texto diferente por questão
Capítulos de crônica, poema e conto passam a usar obras de Machado de Assis
(domínio público); demais capítulos ganham textos e imagens distintos para
cada questão. Material do professor lista os trechos a conferir.

Co-Authored-By: Claude Opus 5.5 <noreply@anthropic.com>
Claude-Session: https://claude.ai/code/session_01S4ktTAQobNJezjCaSQPnsq
</commit_message>
<xml_diff>
--- a/Material_Professor_LP_9ano.docx
+++ b/Material_Professor_LP_9ano.docx
@@ -145,6 +145,46 @@
       </w:r>
       <w:r>
         <w:t xml:space="preserve"> “O tema desse texto é…”, “A expressão destacada contribui, principalmente, para…”, “as metáforas são empregadas com o objetivo de…”.</w:t>
+      </w:r>
+    </w:p>
+    <w:p>
+      <w:pPr>
+        <w:spacing w:after="60" w:before="0" w:line="276"/>
+        <w:ind w:left="284"/>
+        <w:jc w:val="left"/>
+      </w:pPr>
+      <w:r>
+        <w:t xml:space="preserve">▪  </w:t>
+      </w:r>
+      <w:r>
+        <w:rPr>
+          <w:b/>
+          <w:bCs/>
+        </w:rPr>
+        <w:t xml:space="preserve">Uma questão, um texto:</w:t>
+      </w:r>
+      <w:r>
+        <w:t xml:space="preserve"> cada uma das 30 questões traz um texto diferente. Nos capítulos 1 a 3 (crônica, poema e conto), os textos são de </w:t>
+      </w:r>
+      <w:r>
+        <w:rPr>
+          <w:b/>
+          <w:bCs/>
+        </w:rPr>
+        <w:t xml:space="preserve">Machado de Assis</w:t>
+      </w:r>
+      <w:r>
+        <w:t xml:space="preserve">, em domínio público; nos demais capítulos, os textos foram elaborados para fins didáticos, e vários dialogam com a obra de Machado (cordel sobre </w:t>
+      </w:r>
+      <w:r>
+        <w:rPr>
+          <w:i/>
+          <w:iCs/>
+        </w:rPr>
+        <w:t xml:space="preserve">Dom Casmurro</w:t>
+      </w:r>
+      <w:r>
+        <w:t xml:space="preserve">, podcast, debate e vlogs).</w:t>
       </w:r>
     </w:p>
     <w:p>
@@ -463,7 +503,7 @@
                 <w:sz w:val="19"/>
                 <w:szCs w:val="19"/>
               </w:rPr>
-              <w:t xml:space="preserve">2, 6, 7, 11, 17, 27</w:t>
+              <w:t xml:space="preserve">1, 7, 11, 17, 27, 28</w:t>
             </w:r>
           </w:p>
         </w:tc>
@@ -592,7 +632,7 @@
                 <w:sz w:val="19"/>
                 <w:szCs w:val="19"/>
               </w:rPr>
-              <w:t xml:space="preserve">1, 5, 8, 10, 12, 18, 20, 28, 29</w:t>
+              <w:t xml:space="preserve">4, 5, 6, 12, 16, 18, 20, 21, 29</w:t>
             </w:r>
           </w:p>
         </w:tc>
@@ -721,7 +761,7 @@
                 <w:sz w:val="19"/>
                 <w:szCs w:val="19"/>
               </w:rPr>
-              <w:t xml:space="preserve">4, 9, 14, 15, 16, 19, 21, 23, 25</w:t>
+              <w:t xml:space="preserve">3, 8, 10, 14, 15, 19, 23, 25, 30</w:t>
             </w:r>
           </w:p>
         </w:tc>
@@ -850,7 +890,7 @@
                 <w:sz w:val="19"/>
                 <w:szCs w:val="19"/>
               </w:rPr>
-              <w:t xml:space="preserve">3, 13, 22, 24, 26, 30</w:t>
+              <w:t xml:space="preserve">2, 9, 13, 22, 24, 26</w:t>
             </w:r>
           </w:p>
         </w:tc>
@@ -1125,7 +1165,7 @@
                 <w:sz w:val="19"/>
                 <w:szCs w:val="19"/>
               </w:rPr>
-              <w:t xml:space="preserve">B</w:t>
+              <w:t xml:space="preserve">C</w:t>
             </w:r>
           </w:p>
         </w:tc>
@@ -1138,25 +1178,25 @@
               <w:bottom w:val="single" w:color="7F8C9A" w:sz="6"/>
               <w:right w:val="single" w:color="7F8C9A" w:sz="6"/>
             </w:tcBorders>
-            <w:shd w:fill="FFF1C2" w:color="auto" w:val="clear"/>
-            <w:tcMar>
-              <w:top w:type="dxa" w:w="60"/>
-              <w:left w:type="dxa" w:w="100"/>
-              <w:bottom w:type="dxa" w:w="60"/>
-              <w:right w:type="dxa" w:w="100"/>
-            </w:tcMar>
-          </w:tcPr>
-          <w:p>
-            <w:pPr>
-              <w:spacing w:after="0" w:before="0" w:line="276"/>
-              <w:jc w:val="center"/>
-            </w:pPr>
-            <w:r>
-              <w:rPr>
-                <w:sz w:val="19"/>
-                <w:szCs w:val="19"/>
-              </w:rPr>
-              <w:t xml:space="preserve">2</w:t>
+            <w:shd w:fill="F8D7D7" w:color="auto" w:val="clear"/>
+            <w:tcMar>
+              <w:top w:type="dxa" w:w="60"/>
+              <w:left w:type="dxa" w:w="100"/>
+              <w:bottom w:type="dxa" w:w="60"/>
+              <w:right w:type="dxa" w:w="100"/>
+            </w:tcMar>
+          </w:tcPr>
+          <w:p>
+            <w:pPr>
+              <w:spacing w:after="0" w:before="0" w:line="276"/>
+              <w:jc w:val="center"/>
+            </w:pPr>
+            <w:r>
+              <w:rPr>
+                <w:sz w:val="19"/>
+                <w:szCs w:val="19"/>
+              </w:rPr>
+              <w:t xml:space="preserve">1</w:t>
             </w:r>
           </w:p>
         </w:tc>
@@ -1186,7 +1226,7 @@
                 <w:sz w:val="19"/>
                 <w:szCs w:val="19"/>
               </w:rPr>
-              <w:t xml:space="preserve">EF.6a9.LP.6.35</w:t>
+              <w:t xml:space="preserve">EF.6a9.LP.1.02</w:t>
             </w:r>
           </w:p>
         </w:tc>
@@ -1286,7 +1326,7 @@
                 <w:sz w:val="19"/>
                 <w:szCs w:val="19"/>
               </w:rPr>
-              <w:t xml:space="preserve">C</w:t>
+              <w:t xml:space="preserve">E</w:t>
             </w:r>
           </w:p>
         </w:tc>
@@ -1299,25 +1339,25 @@
               <w:bottom w:val="single" w:color="7F8C9A" w:sz="6"/>
               <w:right w:val="single" w:color="7F8C9A" w:sz="6"/>
             </w:tcBorders>
-            <w:shd w:fill="F8D7D7" w:color="auto" w:val="clear"/>
-            <w:tcMar>
-              <w:top w:type="dxa" w:w="60"/>
-              <w:left w:type="dxa" w:w="100"/>
-              <w:bottom w:type="dxa" w:w="60"/>
-              <w:right w:type="dxa" w:w="100"/>
-            </w:tcMar>
-          </w:tcPr>
-          <w:p>
-            <w:pPr>
-              <w:spacing w:after="0" w:before="0" w:line="276"/>
-              <w:jc w:val="center"/>
-            </w:pPr>
-            <w:r>
-              <w:rPr>
-                <w:sz w:val="19"/>
-                <w:szCs w:val="19"/>
-              </w:rPr>
-              <w:t xml:space="preserve">1</w:t>
+            <w:shd w:fill="D6DDF8" w:color="auto" w:val="clear"/>
+            <w:tcMar>
+              <w:top w:type="dxa" w:w="60"/>
+              <w:left w:type="dxa" w:w="100"/>
+              <w:bottom w:type="dxa" w:w="60"/>
+              <w:right w:type="dxa" w:w="100"/>
+            </w:tcMar>
+          </w:tcPr>
+          <w:p>
+            <w:pPr>
+              <w:spacing w:after="0" w:before="0" w:line="276"/>
+              <w:jc w:val="center"/>
+            </w:pPr>
+            <w:r>
+              <w:rPr>
+                <w:sz w:val="19"/>
+                <w:szCs w:val="19"/>
+              </w:rPr>
+              <w:t xml:space="preserve">4</w:t>
             </w:r>
           </w:p>
         </w:tc>
@@ -1348,7 +1388,7 @@
                 <w:sz w:val="19"/>
                 <w:szCs w:val="19"/>
               </w:rPr>
-              <w:t xml:space="preserve">EF.6a9.LP.1.02</w:t>
+              <w:t xml:space="preserve">EF.6a9.LP.1.05</w:t>
             </w:r>
           </w:p>
         </w:tc>
@@ -1447,7 +1487,7 @@
                 <w:sz w:val="19"/>
                 <w:szCs w:val="19"/>
               </w:rPr>
-              <w:t xml:space="preserve">E</w:t>
+              <w:t xml:space="preserve">A</w:t>
             </w:r>
           </w:p>
         </w:tc>
@@ -1460,25 +1500,25 @@
               <w:bottom w:val="single" w:color="7F8C9A" w:sz="6"/>
               <w:right w:val="single" w:color="7F8C9A" w:sz="6"/>
             </w:tcBorders>
-            <w:shd w:fill="D6DDF8" w:color="auto" w:val="clear"/>
-            <w:tcMar>
-              <w:top w:type="dxa" w:w="60"/>
-              <w:left w:type="dxa" w:w="100"/>
-              <w:bottom w:type="dxa" w:w="60"/>
-              <w:right w:type="dxa" w:w="100"/>
-            </w:tcMar>
-          </w:tcPr>
-          <w:p>
-            <w:pPr>
-              <w:spacing w:after="0" w:before="0" w:line="276"/>
-              <w:jc w:val="center"/>
-            </w:pPr>
-            <w:r>
-              <w:rPr>
-                <w:sz w:val="19"/>
-                <w:szCs w:val="19"/>
-              </w:rPr>
-              <w:t xml:space="preserve">4</w:t>
+            <w:shd w:fill="D5F0D5" w:color="auto" w:val="clear"/>
+            <w:tcMar>
+              <w:top w:type="dxa" w:w="60"/>
+              <w:left w:type="dxa" w:w="100"/>
+              <w:bottom w:type="dxa" w:w="60"/>
+              <w:right w:type="dxa" w:w="100"/>
+            </w:tcMar>
+          </w:tcPr>
+          <w:p>
+            <w:pPr>
+              <w:spacing w:after="0" w:before="0" w:line="276"/>
+              <w:jc w:val="center"/>
+            </w:pPr>
+            <w:r>
+              <w:rPr>
+                <w:sz w:val="19"/>
+                <w:szCs w:val="19"/>
+              </w:rPr>
+              <w:t xml:space="preserve">3</w:t>
             </w:r>
           </w:p>
         </w:tc>
@@ -1508,7 +1548,7 @@
                 <w:sz w:val="19"/>
                 <w:szCs w:val="19"/>
               </w:rPr>
-              <w:t xml:space="preserve">EF.6a9.LP.5.33</w:t>
+              <w:t xml:space="preserve">EF.6a9.LP.6.35</w:t>
             </w:r>
           </w:p>
         </w:tc>
@@ -1608,7 +1648,7 @@
                 <w:sz w:val="19"/>
                 <w:szCs w:val="19"/>
               </w:rPr>
-              <w:t xml:space="preserve">A</w:t>
+              <w:t xml:space="preserve">B</w:t>
             </w:r>
           </w:p>
         </w:tc>
@@ -1621,25 +1661,25 @@
               <w:bottom w:val="single" w:color="7F8C9A" w:sz="6"/>
               <w:right w:val="single" w:color="7F8C9A" w:sz="6"/>
             </w:tcBorders>
-            <w:shd w:fill="D5F0D5" w:color="auto" w:val="clear"/>
-            <w:tcMar>
-              <w:top w:type="dxa" w:w="60"/>
-              <w:left w:type="dxa" w:w="100"/>
-              <w:bottom w:type="dxa" w:w="60"/>
-              <w:right w:type="dxa" w:w="100"/>
-            </w:tcMar>
-          </w:tcPr>
-          <w:p>
-            <w:pPr>
-              <w:spacing w:after="0" w:before="0" w:line="276"/>
-              <w:jc w:val="center"/>
-            </w:pPr>
-            <w:r>
-              <w:rPr>
-                <w:sz w:val="19"/>
-                <w:szCs w:val="19"/>
-              </w:rPr>
-              <w:t xml:space="preserve">3</w:t>
+            <w:shd w:fill="FFF1C2" w:color="auto" w:val="clear"/>
+            <w:tcMar>
+              <w:top w:type="dxa" w:w="60"/>
+              <w:left w:type="dxa" w:w="100"/>
+              <w:bottom w:type="dxa" w:w="60"/>
+              <w:right w:type="dxa" w:w="100"/>
+            </w:tcMar>
+          </w:tcPr>
+          <w:p>
+            <w:pPr>
+              <w:spacing w:after="0" w:before="0" w:line="276"/>
+              <w:jc w:val="center"/>
+            </w:pPr>
+            <w:r>
+              <w:rPr>
+                <w:sz w:val="19"/>
+                <w:szCs w:val="19"/>
+              </w:rPr>
+              <w:t xml:space="preserve">2</w:t>
             </w:r>
           </w:p>
         </w:tc>
@@ -1701,7 +1741,7 @@
                 <w:sz w:val="19"/>
                 <w:szCs w:val="19"/>
               </w:rPr>
-              <w:t xml:space="preserve">2. Trilhas sonoras da vida – Música</w:t>
+              <w:t xml:space="preserve">2. Trilhas sonoras da vida – Poema</w:t>
             </w:r>
           </w:p>
         </w:tc>
@@ -1830,7 +1870,7 @@
                 <w:sz w:val="19"/>
                 <w:szCs w:val="19"/>
               </w:rPr>
-              <w:t xml:space="preserve">EF.7a9.LP.6.36</w:t>
+              <w:t xml:space="preserve">EF.6a9.LP.1.05</w:t>
             </w:r>
           </w:p>
         </w:tc>
@@ -1860,7 +1900,7 @@
                 <w:sz w:val="19"/>
                 <w:szCs w:val="19"/>
               </w:rPr>
-              <w:t xml:space="preserve">2. Trilhas sonoras da vida – Música</w:t>
+              <w:t xml:space="preserve">2. Trilhas sonoras da vida – Poema</w:t>
             </w:r>
           </w:p>
         </w:tc>
@@ -1930,7 +1970,7 @@
                 <w:sz w:val="19"/>
                 <w:szCs w:val="19"/>
               </w:rPr>
-              <w:t xml:space="preserve">D</w:t>
+              <w:t xml:space="preserve">A</w:t>
             </w:r>
           </w:p>
         </w:tc>
@@ -1943,25 +1983,25 @@
               <w:bottom w:val="single" w:color="7F8C9A" w:sz="6"/>
               <w:right w:val="single" w:color="7F8C9A" w:sz="6"/>
             </w:tcBorders>
-            <w:shd w:fill="F8D7D7" w:color="auto" w:val="clear"/>
-            <w:tcMar>
-              <w:top w:type="dxa" w:w="60"/>
-              <w:left w:type="dxa" w:w="100"/>
-              <w:bottom w:type="dxa" w:w="60"/>
-              <w:right w:type="dxa" w:w="100"/>
-            </w:tcMar>
-          </w:tcPr>
-          <w:p>
-            <w:pPr>
-              <w:spacing w:after="0" w:before="0" w:line="276"/>
-              <w:jc w:val="center"/>
-            </w:pPr>
-            <w:r>
-              <w:rPr>
-                <w:sz w:val="19"/>
-                <w:szCs w:val="19"/>
-              </w:rPr>
-              <w:t xml:space="preserve">1</w:t>
+            <w:shd w:fill="FFF1C2" w:color="auto" w:val="clear"/>
+            <w:tcMar>
+              <w:top w:type="dxa" w:w="60"/>
+              <w:left w:type="dxa" w:w="100"/>
+              <w:bottom w:type="dxa" w:w="60"/>
+              <w:right w:type="dxa" w:w="100"/>
+            </w:tcMar>
+          </w:tcPr>
+          <w:p>
+            <w:pPr>
+              <w:spacing w:after="0" w:before="0" w:line="276"/>
+              <w:jc w:val="center"/>
+            </w:pPr>
+            <w:r>
+              <w:rPr>
+                <w:sz w:val="19"/>
+                <w:szCs w:val="19"/>
+              </w:rPr>
+              <w:t xml:space="preserve">2</w:t>
             </w:r>
           </w:p>
         </w:tc>
@@ -1992,7 +2032,7 @@
                 <w:sz w:val="19"/>
                 <w:szCs w:val="19"/>
               </w:rPr>
-              <w:t xml:space="preserve">EF.6a9.LP.5.30</w:t>
+              <w:t xml:space="preserve">EF.6a9.LP.5.33</w:t>
             </w:r>
           </w:p>
         </w:tc>
@@ -2023,7 +2063,7 @@
                 <w:sz w:val="19"/>
                 <w:szCs w:val="19"/>
               </w:rPr>
-              <w:t xml:space="preserve">2. Trilhas sonoras da vida – Música</w:t>
+              <w:t xml:space="preserve">2. Trilhas sonoras da vida – Poema</w:t>
             </w:r>
           </w:p>
         </w:tc>
@@ -2252,7 +2292,7 @@
                 <w:sz w:val="19"/>
                 <w:szCs w:val="19"/>
               </w:rPr>
-              <w:t xml:space="preserve">E</w:t>
+              <w:t xml:space="preserve">B</w:t>
             </w:r>
           </w:p>
         </w:tc>
@@ -2265,25 +2305,25 @@
               <w:bottom w:val="single" w:color="7F8C9A" w:sz="6"/>
               <w:right w:val="single" w:color="7F8C9A" w:sz="6"/>
             </w:tcBorders>
-            <w:shd w:fill="FFF1C2" w:color="auto" w:val="clear"/>
-            <w:tcMar>
-              <w:top w:type="dxa" w:w="60"/>
-              <w:left w:type="dxa" w:w="100"/>
-              <w:bottom w:type="dxa" w:w="60"/>
-              <w:right w:type="dxa" w:w="100"/>
-            </w:tcMar>
-          </w:tcPr>
-          <w:p>
-            <w:pPr>
-              <w:spacing w:after="0" w:before="0" w:line="276"/>
-              <w:jc w:val="center"/>
-            </w:pPr>
-            <w:r>
-              <w:rPr>
-                <w:sz w:val="19"/>
-                <w:szCs w:val="19"/>
-              </w:rPr>
-              <w:t xml:space="preserve">2</w:t>
+            <w:shd w:fill="D5F0D5" w:color="auto" w:val="clear"/>
+            <w:tcMar>
+              <w:top w:type="dxa" w:w="60"/>
+              <w:left w:type="dxa" w:w="100"/>
+              <w:bottom w:type="dxa" w:w="60"/>
+              <w:right w:type="dxa" w:w="100"/>
+            </w:tcMar>
+          </w:tcPr>
+          <w:p>
+            <w:pPr>
+              <w:spacing w:after="0" w:before="0" w:line="276"/>
+              <w:jc w:val="center"/>
+            </w:pPr>
+            <w:r>
+              <w:rPr>
+                <w:sz w:val="19"/>
+                <w:szCs w:val="19"/>
+              </w:rPr>
+              <w:t xml:space="preserve">3</w:t>
             </w:r>
           </w:p>
         </w:tc>
@@ -2314,7 +2354,7 @@
                 <w:sz w:val="19"/>
                 <w:szCs w:val="19"/>
               </w:rPr>
-              <w:t xml:space="preserve">EF.6a9.LP.6.44</w:t>
+              <w:t xml:space="preserve">EF.68e9.LP.1.12</w:t>
             </w:r>
           </w:p>
         </w:tc>
@@ -2413,7 +2453,7 @@
                 <w:sz w:val="19"/>
                 <w:szCs w:val="19"/>
               </w:rPr>
-              <w:t xml:space="preserve">D</w:t>
+              <w:t xml:space="preserve">E</w:t>
             </w:r>
           </w:p>
         </w:tc>
@@ -2426,25 +2466,25 @@
               <w:bottom w:val="single" w:color="7F8C9A" w:sz="6"/>
               <w:right w:val="single" w:color="7F8C9A" w:sz="6"/>
             </w:tcBorders>
-            <w:shd w:fill="D5F0D5" w:color="auto" w:val="clear"/>
-            <w:tcMar>
-              <w:top w:type="dxa" w:w="60"/>
-              <w:left w:type="dxa" w:w="100"/>
-              <w:bottom w:type="dxa" w:w="60"/>
-              <w:right w:type="dxa" w:w="100"/>
-            </w:tcMar>
-          </w:tcPr>
-          <w:p>
-            <w:pPr>
-              <w:spacing w:after="0" w:before="0" w:line="276"/>
-              <w:jc w:val="center"/>
-            </w:pPr>
-            <w:r>
-              <w:rPr>
-                <w:sz w:val="19"/>
-                <w:szCs w:val="19"/>
-              </w:rPr>
-              <w:t xml:space="preserve">3</w:t>
+            <w:shd w:fill="D6DDF8" w:color="auto" w:val="clear"/>
+            <w:tcMar>
+              <w:top w:type="dxa" w:w="60"/>
+              <w:left w:type="dxa" w:w="100"/>
+              <w:bottom w:type="dxa" w:w="60"/>
+              <w:right w:type="dxa" w:w="100"/>
+            </w:tcMar>
+          </w:tcPr>
+          <w:p>
+            <w:pPr>
+              <w:spacing w:after="0" w:before="0" w:line="276"/>
+              <w:jc w:val="center"/>
+            </w:pPr>
+            <w:r>
+              <w:rPr>
+                <w:sz w:val="19"/>
+                <w:szCs w:val="19"/>
+              </w:rPr>
+              <w:t xml:space="preserve">4</w:t>
             </w:r>
           </w:p>
         </w:tc>
@@ -2474,7 +2514,7 @@
                 <w:sz w:val="19"/>
                 <w:szCs w:val="19"/>
               </w:rPr>
-              <w:t xml:space="preserve">EF.7a9.LP.1.13</w:t>
+              <w:t xml:space="preserve">EF.6a9.LP.5.30</w:t>
             </w:r>
           </w:p>
         </w:tc>
@@ -2574,7 +2614,7 @@
                 <w:sz w:val="19"/>
                 <w:szCs w:val="19"/>
               </w:rPr>
-              <w:t xml:space="preserve">A</w:t>
+              <w:t xml:space="preserve">D</w:t>
             </w:r>
           </w:p>
         </w:tc>
@@ -2587,25 +2627,25 @@
               <w:bottom w:val="single" w:color="7F8C9A" w:sz="6"/>
               <w:right w:val="single" w:color="7F8C9A" w:sz="6"/>
             </w:tcBorders>
-            <w:shd w:fill="FFF1C2" w:color="auto" w:val="clear"/>
-            <w:tcMar>
-              <w:top w:type="dxa" w:w="60"/>
-              <w:left w:type="dxa" w:w="100"/>
-              <w:bottom w:type="dxa" w:w="60"/>
-              <w:right w:type="dxa" w:w="100"/>
-            </w:tcMar>
-          </w:tcPr>
-          <w:p>
-            <w:pPr>
-              <w:spacing w:after="0" w:before="0" w:line="276"/>
-              <w:jc w:val="center"/>
-            </w:pPr>
-            <w:r>
-              <w:rPr>
-                <w:sz w:val="19"/>
-                <w:szCs w:val="19"/>
-              </w:rPr>
-              <w:t xml:space="preserve">2</w:t>
+            <w:shd w:fill="D5F0D5" w:color="auto" w:val="clear"/>
+            <w:tcMar>
+              <w:top w:type="dxa" w:w="60"/>
+              <w:left w:type="dxa" w:w="100"/>
+              <w:bottom w:type="dxa" w:w="60"/>
+              <w:right w:type="dxa" w:w="100"/>
+            </w:tcMar>
+          </w:tcPr>
+          <w:p>
+            <w:pPr>
+              <w:spacing w:after="0" w:before="0" w:line="276"/>
+              <w:jc w:val="center"/>
+            </w:pPr>
+            <w:r>
+              <w:rPr>
+                <w:sz w:val="19"/>
+                <w:szCs w:val="19"/>
+              </w:rPr>
+              <w:t xml:space="preserve">3</w:t>
             </w:r>
           </w:p>
         </w:tc>
@@ -2636,7 +2676,7 @@
                 <w:sz w:val="19"/>
                 <w:szCs w:val="19"/>
               </w:rPr>
-              <w:t xml:space="preserve">EF.6a9.LP.5.30</w:t>
+              <w:t xml:space="preserve">EF.7a9.LP.1.13</w:t>
             </w:r>
           </w:p>
         </w:tc>
@@ -3379,7 +3419,7 @@
                 <w:sz w:val="19"/>
                 <w:szCs w:val="19"/>
               </w:rPr>
-              <w:t xml:space="preserve">B</w:t>
+              <w:t xml:space="preserve">D</w:t>
             </w:r>
           </w:p>
         </w:tc>
@@ -3540,7 +3580,7 @@
                 <w:sz w:val="19"/>
                 <w:szCs w:val="19"/>
               </w:rPr>
-              <w:t xml:space="preserve">A</w:t>
+              <w:t xml:space="preserve">B</w:t>
             </w:r>
           </w:p>
         </w:tc>
@@ -3553,25 +3593,25 @@
               <w:bottom w:val="single" w:color="7F8C9A" w:sz="6"/>
               <w:right w:val="single" w:color="7F8C9A" w:sz="6"/>
             </w:tcBorders>
-            <w:shd w:fill="D5F0D5" w:color="auto" w:val="clear"/>
-            <w:tcMar>
-              <w:top w:type="dxa" w:w="60"/>
-              <w:left w:type="dxa" w:w="100"/>
-              <w:bottom w:type="dxa" w:w="60"/>
-              <w:right w:type="dxa" w:w="100"/>
-            </w:tcMar>
-          </w:tcPr>
-          <w:p>
-            <w:pPr>
-              <w:spacing w:after="0" w:before="0" w:line="276"/>
-              <w:jc w:val="center"/>
-            </w:pPr>
-            <w:r>
-              <w:rPr>
-                <w:sz w:val="19"/>
-                <w:szCs w:val="19"/>
-              </w:rPr>
-              <w:t xml:space="preserve">3</w:t>
+            <w:shd w:fill="FFF1C2" w:color="auto" w:val="clear"/>
+            <w:tcMar>
+              <w:top w:type="dxa" w:w="60"/>
+              <w:left w:type="dxa" w:w="100"/>
+              <w:bottom w:type="dxa" w:w="60"/>
+              <w:right w:type="dxa" w:w="100"/>
+            </w:tcMar>
+          </w:tcPr>
+          <w:p>
+            <w:pPr>
+              <w:spacing w:after="0" w:before="0" w:line="276"/>
+              <w:jc w:val="center"/>
+            </w:pPr>
+            <w:r>
+              <w:rPr>
+                <w:sz w:val="19"/>
+                <w:szCs w:val="19"/>
+              </w:rPr>
+              <w:t xml:space="preserve">2</w:t>
             </w:r>
           </w:p>
         </w:tc>
@@ -3862,7 +3902,7 @@
                 <w:sz w:val="19"/>
                 <w:szCs w:val="19"/>
               </w:rPr>
-              <w:t xml:space="preserve">B</w:t>
+              <w:t xml:space="preserve">C</w:t>
             </w:r>
           </w:p>
         </w:tc>
@@ -3924,7 +3964,7 @@
                 <w:sz w:val="19"/>
                 <w:szCs w:val="19"/>
               </w:rPr>
-              <w:t xml:space="preserve">EF.6a9.LP.3.23</w:t>
+              <w:t xml:space="preserve">EF.7a9.LP.6.36</w:t>
             </w:r>
           </w:p>
         </w:tc>
@@ -4184,7 +4224,7 @@
                 <w:sz w:val="19"/>
                 <w:szCs w:val="19"/>
               </w:rPr>
-              <w:t xml:space="preserve">C</w:t>
+              <w:t xml:space="preserve">A</w:t>
             </w:r>
           </w:p>
         </w:tc>
@@ -4345,7 +4385,7 @@
                 <w:sz w:val="19"/>
                 <w:szCs w:val="19"/>
               </w:rPr>
-              <w:t xml:space="preserve">A</w:t>
+              <w:t xml:space="preserve">B</w:t>
             </w:r>
           </w:p>
         </w:tc>
@@ -4358,25 +4398,25 @@
               <w:bottom w:val="single" w:color="7F8C9A" w:sz="6"/>
               <w:right w:val="single" w:color="7F8C9A" w:sz="6"/>
             </w:tcBorders>
-            <w:shd w:fill="D5F0D5" w:color="auto" w:val="clear"/>
-            <w:tcMar>
-              <w:top w:type="dxa" w:w="60"/>
-              <w:left w:type="dxa" w:w="100"/>
-              <w:bottom w:type="dxa" w:w="60"/>
-              <w:right w:type="dxa" w:w="100"/>
-            </w:tcMar>
-          </w:tcPr>
-          <w:p>
-            <w:pPr>
-              <w:spacing w:after="0" w:before="0" w:line="276"/>
-              <w:jc w:val="center"/>
-            </w:pPr>
-            <w:r>
-              <w:rPr>
-                <w:sz w:val="19"/>
-                <w:szCs w:val="19"/>
-              </w:rPr>
-              <w:t xml:space="preserve">3</w:t>
+            <w:shd w:fill="FFF1C2" w:color="auto" w:val="clear"/>
+            <w:tcMar>
+              <w:top w:type="dxa" w:w="60"/>
+              <w:left w:type="dxa" w:w="100"/>
+              <w:bottom w:type="dxa" w:w="60"/>
+              <w:right w:type="dxa" w:w="100"/>
+            </w:tcMar>
+          </w:tcPr>
+          <w:p>
+            <w:pPr>
+              <w:spacing w:after="0" w:before="0" w:line="276"/>
+              <w:jc w:val="center"/>
+            </w:pPr>
+            <w:r>
+              <w:rPr>
+                <w:sz w:val="19"/>
+                <w:szCs w:val="19"/>
+              </w:rPr>
+              <w:t xml:space="preserve">2</w:t>
             </w:r>
           </w:p>
         </w:tc>
@@ -4667,7 +4707,7 @@
                 <w:sz w:val="19"/>
                 <w:szCs w:val="19"/>
               </w:rPr>
-              <w:t xml:space="preserve">B</w:t>
+              <w:t xml:space="preserve">C</w:t>
             </w:r>
           </w:p>
         </w:tc>
@@ -4989,7 +5029,7 @@
                 <w:sz w:val="19"/>
                 <w:szCs w:val="19"/>
               </w:rPr>
-              <w:t xml:space="preserve">C</w:t>
+              <w:t xml:space="preserve">A</w:t>
             </w:r>
           </w:p>
         </w:tc>
@@ -5150,7 +5190,7 @@
                 <w:sz w:val="19"/>
                 <w:szCs w:val="19"/>
               </w:rPr>
-              <w:t xml:space="preserve">A</w:t>
+              <w:t xml:space="preserve">B</w:t>
             </w:r>
           </w:p>
         </w:tc>
@@ -5311,7 +5351,7 @@
                 <w:sz w:val="19"/>
                 <w:szCs w:val="19"/>
               </w:rPr>
-              <w:t xml:space="preserve">B</w:t>
+              <w:t xml:space="preserve">C</w:t>
             </w:r>
           </w:p>
         </w:tc>
@@ -5472,7 +5512,7 @@
                 <w:sz w:val="19"/>
                 <w:szCs w:val="19"/>
               </w:rPr>
-              <w:t xml:space="preserve">D</w:t>
+              <w:t xml:space="preserve">E</w:t>
             </w:r>
           </w:p>
         </w:tc>
@@ -5485,25 +5525,25 @@
               <w:bottom w:val="single" w:color="7F8C9A" w:sz="6"/>
               <w:right w:val="single" w:color="7F8C9A" w:sz="6"/>
             </w:tcBorders>
-            <w:shd w:fill="FFF1C2" w:color="auto" w:val="clear"/>
-            <w:tcMar>
-              <w:top w:type="dxa" w:w="60"/>
-              <w:left w:type="dxa" w:w="100"/>
-              <w:bottom w:type="dxa" w:w="60"/>
-              <w:right w:type="dxa" w:w="100"/>
-            </w:tcMar>
-          </w:tcPr>
-          <w:p>
-            <w:pPr>
-              <w:spacing w:after="0" w:before="0" w:line="276"/>
-              <w:jc w:val="center"/>
-            </w:pPr>
-            <w:r>
-              <w:rPr>
-                <w:sz w:val="19"/>
-                <w:szCs w:val="19"/>
-              </w:rPr>
-              <w:t xml:space="preserve">2</w:t>
+            <w:shd w:fill="F8D7D7" w:color="auto" w:val="clear"/>
+            <w:tcMar>
+              <w:top w:type="dxa" w:w="60"/>
+              <w:left w:type="dxa" w:w="100"/>
+              <w:bottom w:type="dxa" w:w="60"/>
+              <w:right w:type="dxa" w:w="100"/>
+            </w:tcMar>
+          </w:tcPr>
+          <w:p>
+            <w:pPr>
+              <w:spacing w:after="0" w:before="0" w:line="276"/>
+              <w:jc w:val="center"/>
+            </w:pPr>
+            <w:r>
+              <w:rPr>
+                <w:sz w:val="19"/>
+                <w:szCs w:val="19"/>
+              </w:rPr>
+              <w:t xml:space="preserve">1</w:t>
             </w:r>
           </w:p>
         </w:tc>
@@ -5633,7 +5673,7 @@
                 <w:sz w:val="19"/>
                 <w:szCs w:val="19"/>
               </w:rPr>
-              <w:t xml:space="preserve">E</w:t>
+              <w:t xml:space="preserve">D</w:t>
             </w:r>
           </w:p>
         </w:tc>
@@ -5794,7 +5834,7 @@
                 <w:sz w:val="19"/>
                 <w:szCs w:val="19"/>
               </w:rPr>
-              <w:t xml:space="preserve">C</w:t>
+              <w:t xml:space="preserve">A</w:t>
             </w:r>
           </w:p>
         </w:tc>
@@ -5807,25 +5847,25 @@
               <w:bottom w:val="single" w:color="7F8C9A" w:sz="6"/>
               <w:right w:val="single" w:color="7F8C9A" w:sz="6"/>
             </w:tcBorders>
-            <w:shd w:fill="D6DDF8" w:color="auto" w:val="clear"/>
-            <w:tcMar>
-              <w:top w:type="dxa" w:w="60"/>
-              <w:left w:type="dxa" w:w="100"/>
-              <w:bottom w:type="dxa" w:w="60"/>
-              <w:right w:type="dxa" w:w="100"/>
-            </w:tcMar>
-          </w:tcPr>
-          <w:p>
-            <w:pPr>
-              <w:spacing w:after="0" w:before="0" w:line="276"/>
-              <w:jc w:val="center"/>
-            </w:pPr>
-            <w:r>
-              <w:rPr>
-                <w:sz w:val="19"/>
-                <w:szCs w:val="19"/>
-              </w:rPr>
-              <w:t xml:space="preserve">4</w:t>
+            <w:shd w:fill="D5F0D5" w:color="auto" w:val="clear"/>
+            <w:tcMar>
+              <w:top w:type="dxa" w:w="60"/>
+              <w:left w:type="dxa" w:w="100"/>
+              <w:bottom w:type="dxa" w:w="60"/>
+              <w:right w:type="dxa" w:w="100"/>
+            </w:tcMar>
+          </w:tcPr>
+          <w:p>
+            <w:pPr>
+              <w:spacing w:after="0" w:before="0" w:line="276"/>
+              <w:jc w:val="center"/>
+            </w:pPr>
+            <w:r>
+              <w:rPr>
+                <w:sz w:val="19"/>
+                <w:szCs w:val="19"/>
+              </w:rPr>
+              <w:t xml:space="preserve">3</w:t>
             </w:r>
           </w:p>
         </w:tc>
@@ -5936,7 +5976,7 @@
           <w:sz w:val="19"/>
           <w:szCs w:val="19"/>
         </w:rPr>
-        <w:t xml:space="preserve">   Resposta: B   |   Nível 2   |   EF.6a9.LP.6.35</w:t>
+        <w:t xml:space="preserve">   Resposta: C   |   Nível 1   |   EF.6a9.LP.1.02</w:t>
       </w:r>
     </w:p>
     <w:p>
@@ -5959,7 +5999,7 @@
           <w:sz w:val="20"/>
           <w:szCs w:val="20"/>
         </w:rPr>
-        <w:t xml:space="preserve"> Distinguir marcas de formalidade e informalidade em textos e suas situações comunicativas.</w:t>
+        <w:t xml:space="preserve"> Identificar o tema, a finalidade e/ou o possível público-alvo de textos de diferentes gêneros.</w:t>
       </w:r>
     </w:p>
     <w:p>
@@ -5981,7 +6021,7 @@
           <w:sz w:val="20"/>
           <w:szCs w:val="20"/>
         </w:rPr>
-        <w:t xml:space="preserve"> O texto afirma que “ninguém fica sem pão por falar ‘errado’” e que seu Joaquim entende todos os registros. Os distratores A, C e D partem da ideia preconceituosa de que só a norma-padrão comunica; E contradiz o texto (o sotaque de seu Joaquim é “o mesmo” para todos).</w:t>
+        <w:t xml:space="preserve"> A resposta está explícita: “Essas vizinhas [...] sentaram-se à porta, para debicar os sucessos do dia. [...] Eis a origem da crônica.” Os distratores retomam palavras do texto (sol, lua, febre amarela, Petrópolis, jantar) fora de contexto, armadilha típica para quem lê sem compreender.</w:t>
       </w:r>
     </w:p>
     <w:p>
@@ -6006,7 +6046,7 @@
           <w:sz w:val="19"/>
           <w:szCs w:val="19"/>
         </w:rPr>
-        <w:t xml:space="preserve">   Resposta: C   |   Nível 1   |   EF.6a9.LP.1.02</w:t>
+        <w:t xml:space="preserve">   Resposta: E   |   Nível 4   |   EF.6a9.LP.1.05</w:t>
       </w:r>
     </w:p>
     <w:p>
@@ -6029,7 +6069,7 @@
           <w:sz w:val="20"/>
           <w:szCs w:val="20"/>
         </w:rPr>
-        <w:t xml:space="preserve"> Reconhecer elementos narrativos que caracterizam textos de diferentes gêneros (tempo, espaço, personagens, foco narrativo, enredo).</w:t>
+        <w:t xml:space="preserve"> Reconhecer o efeito de sentido de figuras de linguagem em textos de diferentes gêneros.</w:t>
       </w:r>
     </w:p>
     <w:p>
@@ -6051,7 +6091,7 @@
           <w:sz w:val="20"/>
           <w:szCs w:val="20"/>
         </w:rPr>
-        <w:t xml:space="preserve"> Item de localização de informação explícita (“Toda manhã, às sete em ponto, a padaria…”). Nível 1: tempo e espaço da narrativa, com apoio direto no texto. O distrator E aproveita informações do texto fora de contexto.</w:t>
+        <w:t xml:space="preserve"> Item de nível 4: exige perceber a ironia e o contexto histórico. O narrador “alforria” Pancrácio apenas quando a lei já seria aprovada (“profeta depois do gato morto”), mantém o rapaz servindo por um ordenado e o agride, chamando isso de “efeitos da liberdade”. Os distratores A e B são leituras literais que não percebem a crítica.</w:t>
       </w:r>
     </w:p>
     <w:p>
@@ -6076,7 +6116,7 @@
           <w:sz w:val="19"/>
           <w:szCs w:val="19"/>
         </w:rPr>
-        <w:t xml:space="preserve">   Resposta: E   |   Nível 4   |   EF.6a9.LP.5.33</w:t>
+        <w:t xml:space="preserve">   Resposta: A   |   Nível 3   |   EF.6a9.LP.6.35</w:t>
       </w:r>
     </w:p>
     <w:p>
@@ -6099,7 +6139,7 @@
           <w:sz w:val="20"/>
           <w:szCs w:val="20"/>
         </w:rPr>
-        <w:t xml:space="preserve"> Inferir o sentido figurado ou literal de uma palavra ou expressão a partir de seu contexto de uso.</w:t>
+        <w:t xml:space="preserve"> Identificar a tese, os argumentos e/ou os mecanismos de persuasão presentes em textos de diferentes gêneros.</w:t>
       </w:r>
     </w:p>
     <w:p>
@@ -6121,7 +6161,7 @@
           <w:sz w:val="20"/>
           <w:szCs w:val="20"/>
         </w:rPr>
-        <w:t xml:space="preserve"> Exige inferir o sentido literal e figurado de “sonho” e relacioná-lo a “minha dieta” — humor/ambiguidade, habilidade que o relatório situa no nível 4. O distrator B é uma leitura literal e incompleta de “infelizmente”.</w:t>
+        <w:t xml:space="preserve"> O estudante precisa identificar a tese a partir de uma linguagem do século XIX (“ganham direito de cidade” = passam a ser aceitas). O texto dialoga com o tema da variação linguística do capítulo. O distrator B inverte a tese (“Querer que a nossa pare no século de quinhentos, é um erro”).</w:t>
       </w:r>
     </w:p>
     <w:p>
@@ -6146,7 +6186,7 @@
           <w:sz w:val="19"/>
           <w:szCs w:val="19"/>
         </w:rPr>
-        <w:t xml:space="preserve">   Resposta: A   |   Nível 3   |   EF.6a9.LP.1.05</w:t>
+        <w:t xml:space="preserve">   Resposta: B   |   Nível 2   |   EF.6a9.LP.1.05</w:t>
       </w:r>
     </w:p>
     <w:p>
@@ -6191,7 +6231,7 @@
           <w:sz w:val="20"/>
           <w:szCs w:val="20"/>
         </w:rPr>
-        <w:t xml:space="preserve"> O estudante precisa reconhecer a metáfora e relacioná-la ao tema global (refrão “Minha vida tem trilha sonora”). O distrator C é uma leitura literal da metáfora, erro típico dos níveis 1 e 2.</w:t>
+        <w:t xml:space="preserve"> A personificação permite que os seres “falem” e desejem. O título “Círculo vicioso” se explica pelo último verso, em que o sol quer ser vaga-lume, fechando o ciclo. O distrator C contradiz o texto (“Pesa-me esta brilhante auréola”).</w:t>
       </w:r>
     </w:p>
     <w:p>
@@ -6216,7 +6256,7 @@
           <w:sz w:val="19"/>
           <w:szCs w:val="19"/>
         </w:rPr>
-        <w:t xml:space="preserve">   Resposta: D   |   Nível 2   |   EF.7a9.LP.6.36</w:t>
+        <w:t xml:space="preserve">   Resposta: D   |   Nível 2   |   EF.6a9.LP.1.05</w:t>
       </w:r>
     </w:p>
     <w:p>
@@ -6239,7 +6279,7 @@
           <w:sz w:val="20"/>
           <w:szCs w:val="20"/>
         </w:rPr>
-        <w:t xml:space="preserve"> Identificar a estrutura e/ou sentido de uma palavra a partir de seus processos de formação em língua portuguesa.</w:t>
+        <w:t xml:space="preserve"> Inferir o sentido figurado ou literal de uma palavra ou expressão a partir de seu contexto de uso.</w:t>
       </w:r>
     </w:p>
     <w:p>
@@ -6261,7 +6301,7 @@
           <w:sz w:val="20"/>
           <w:szCs w:val="20"/>
         </w:rPr>
-        <w:t xml:space="preserve"> O relatório destaca que, no 9º ano, a canção foi usada para avaliar a derivação sufixal. O item pede o processo e o efeito de sentido (cantar baixinho, distraidamente). O distrator B é uma armadilha de segmentação (“canta + rola”).</w:t>
+        <w:t xml:space="preserve"> Inferência de sentido figurado (eufemismo) apoiada no contexto: “Em que descansas dessa longa vida”, “flores”, “mortos nos deixa e separados”. O distrator A é a leitura literal de “leito”.</w:t>
       </w:r>
     </w:p>
     <w:p>
@@ -6286,7 +6326,7 @@
           <w:sz w:val="19"/>
           <w:szCs w:val="19"/>
         </w:rPr>
-        <w:t xml:space="preserve">   Resposta: D   |   Nível 1   |   EF.6a9.LP.5.30</w:t>
+        <w:t xml:space="preserve">   Resposta: A   |   Nível 2   |   EF.6a9.LP.5.33</w:t>
       </w:r>
     </w:p>
     <w:p>
@@ -6309,7 +6349,7 @@
           <w:sz w:val="20"/>
           <w:szCs w:val="20"/>
         </w:rPr>
-        <w:t xml:space="preserve"> Identificar o tema, a finalidade e/ou o possível público-alvo de textos de diferentes gêneros.</w:t>
+        <w:t xml:space="preserve"> Identificar o efeito de sentido promovido por recursos expressivos e/ou estilísticos em textos do campo artístico-literário.</w:t>
       </w:r>
     </w:p>
     <w:p>
@@ -6331,7 +6371,7 @@
           <w:sz w:val="20"/>
           <w:szCs w:val="20"/>
         </w:rPr>
-        <w:t xml:space="preserve"> Identificação do tema a partir de pistas recorrentes (refrão, campo lexical da música). O distrator B parte de um detalhe (a mãe) e o amplia sem apoio no texto, erro comum de quem lê apenas fragmentos.</w:t>
+        <w:t xml:space="preserve"> Recurso expressivo (repetição e polissíndeto) relacionado ao sentido. O relatório aponta dificuldade no nível 1 em reconhecer efeitos de sentido de recursos expressivos.</w:t>
       </w:r>
     </w:p>
     <w:p>
@@ -6401,7 +6441,7 @@
           <w:sz w:val="20"/>
           <w:szCs w:val="20"/>
         </w:rPr>
-        <w:t xml:space="preserve"> Identificar o tipo de narrador é, segundo o relatório, uma capacidade já presente no nível 1. O distrator D confunde a voz das cartas (1ª pessoa, de Amira) com a do narrador.</w:t>
+        <w:t xml:space="preserve"> Marcas de 1ª pessoa (“Nunca pude entender”, “contava eu dezessete”) e de tempo passado (“há muitos anos”) caracterizam o narrador-personagem que rememora. Item de nível 1: elemento básico da narrativa com apoio explícito.</w:t>
       </w:r>
     </w:p>
     <w:p>
@@ -6426,7 +6466,7 @@
           <w:sz w:val="19"/>
           <w:szCs w:val="19"/>
         </w:rPr>
-        <w:t xml:space="preserve">   Resposta: E   |   Nível 2   |   EF.6a9.LP.6.44</w:t>
+        <w:t xml:space="preserve">   Resposta: B   |   Nível 3   |   EF.68e9.LP.1.12</w:t>
       </w:r>
     </w:p>
     <w:p>
@@ -6449,7 +6489,7 @@
           <w:sz w:val="20"/>
           <w:szCs w:val="20"/>
         </w:rPr>
-        <w:t xml:space="preserve"> Reconhecer as marcas linguísticas que evidenciam o tipo de citação, discurso e/ou referenciação em textos de diferentes gêneros.</w:t>
+        <w:t xml:space="preserve"> Analisar relações de intertextualidade e/ou interdiscurso entre diferentes textos.</w:t>
       </w:r>
     </w:p>
     <w:p>
@@ -6471,7 +6511,7 @@
           <w:sz w:val="20"/>
           <w:szCs w:val="20"/>
         </w:rPr>
-        <w:t xml:space="preserve"> Referenciação pronominal com uma camada figurada: o termo retomado é “palavras”, comparadas a pedrinhas. O distrator A é a leitura literal da comparação.</w:t>
+        <w:t xml:space="preserve"> O relatório situa a intertextualidade nos níveis 3 e 4. O narrador declara a relação (“Era a mesma explicação que dava a bela Rita”), e o estudante precisa perceber sua função: antecipar o tema e dar autoridade à crença de Rita. O distrator D confunde a crença da personagem com uma verdade do texto.</w:t>
       </w:r>
     </w:p>
     <w:p>
@@ -6496,7 +6536,7 @@
           <w:sz w:val="19"/>
           <w:szCs w:val="19"/>
         </w:rPr>
-        <w:t xml:space="preserve">   Resposta: D   |   Nível 3   |   EF.7a9.LP.1.13</w:t>
+        <w:t xml:space="preserve">   Resposta: E   |   Nível 4   |   EF.6a9.LP.5.30</w:t>
       </w:r>
     </w:p>
     <w:p>
@@ -6519,7 +6559,7 @@
           <w:sz w:val="20"/>
           <w:szCs w:val="20"/>
         </w:rPr>
-        <w:t xml:space="preserve"> Reconhecer as marcas linguísticas que evidenciam o tipo de citação, discurso e/ou referenciação em textos de diferentes gêneros.</w:t>
+        <w:t xml:space="preserve"> Reconhecer a presença de valores culturais e sociais em diferentes tipos de produções artístico-literárias.</w:t>
       </w:r>
     </w:p>
     <w:p>
@@ -6541,7 +6581,7 @@
           <w:sz w:val="20"/>
           <w:szCs w:val="20"/>
         </w:rPr>
-        <w:t xml:space="preserve"> A transposição exige ajustar pronome demonstrativo (essa → aquela), pessoa (você → ela) e tempo verbal, além de introduzir a conjunção “que”. O relatório cita o conto e a crônica como gêneros usados para avaliar discurso direto e indireto.</w:t>
+        <w:t xml:space="preserve"> Item de nível 4: exige perceber a ironia, ou seja, a distância entre o que o narrador diz e o que o texto denuncia. O distrator A é a leitura literal; B ignora a escolha de palavras (“grotesco”, “cruel”).</w:t>
       </w:r>
     </w:p>
     <w:p>
@@ -6566,7 +6606,7 @@
           <w:sz w:val="19"/>
           <w:szCs w:val="19"/>
         </w:rPr>
-        <w:t xml:space="preserve">   Resposta: A   |   Nível 2   |   EF.6a9.LP.5.30</w:t>
+        <w:t xml:space="preserve">   Resposta: D   |   Nível 3   |   EF.7a9.LP.1.13</w:t>
       </w:r>
     </w:p>
     <w:p>
@@ -6589,7 +6629,7 @@
           <w:sz w:val="20"/>
           <w:szCs w:val="20"/>
         </w:rPr>
-        <w:t xml:space="preserve"> Reconhecer a presença de valores culturais e sociais em diferentes tipos de produções artístico-literárias.</w:t>
+        <w:t xml:space="preserve"> Reconhecer as marcas linguísticas que evidenciam o tipo de citação, discurso e/ou referenciação em textos de diferentes gêneros.</w:t>
       </w:r>
     </w:p>
     <w:p>
@@ -6611,7 +6651,7 @@
           <w:sz w:val="20"/>
           <w:szCs w:val="20"/>
         </w:rPr>
-        <w:t xml:space="preserve"> Une dois aspectos que o relatório destaca para o conto: conflito gerador (sentir-se estrangeira) e desfecho (o gesto de Lucas, os “dois lápis lado a lado”), além dos valores sociais.</w:t>
+        <w:t xml:space="preserve"> A transposição exige ajustar pessoa, tempo verbal (presente → pretérito imperfeito), modo (imperativo → subjuntivo) e incluir verbos de dizer. O distrator E troca quem fala, o que exige atenção aos travessões.</w:t>
       </w:r>
     </w:p>
     <w:p>
@@ -6681,7 +6721,7 @@
           <w:sz w:val="20"/>
           <w:szCs w:val="20"/>
         </w:rPr>
-        <w:t xml:space="preserve"> Finalidade e público-alvo de um gênero do cotidiano. O distrator A é plausível (“feito para durar”), mas o anúncio não apresenta informações técnicas: apela à emoção.</w:t>
+        <w:t xml:space="preserve"> Finalidade e público-alvo. O distrator A é plausível (“Feito para durar”), mas o anúncio não traz informações técnicas: apela à emoção e às lembranças.</w:t>
       </w:r>
     </w:p>
     <w:p>
@@ -6751,7 +6791,7 @@
           <w:sz w:val="20"/>
           <w:szCs w:val="20"/>
         </w:rPr>
-        <w:t xml:space="preserve"> Corresponde ao item-modelo de nível 2 do relatório (relação entre texto verbal e não verbal): é preciso integrar imagem e título para chegar ao sentido global, e não interpretar apenas uma das linguagens.</w:t>
+        <w:t xml:space="preserve"> Corresponde ao item-modelo de nível 2 do relatório: integrar imagem e texto verbal para chegar ao sentido figurado (“mundo” = experiências). Os distratores fazem leituras literais da imagem do globo.</w:t>
       </w:r>
     </w:p>
     <w:p>
@@ -6821,7 +6861,7 @@
           <w:sz w:val="20"/>
           <w:szCs w:val="20"/>
         </w:rPr>
-        <w:t xml:space="preserve"> O relatório indica que o anúncio publicitário foi usado para avaliar formalidade/informalidade e colocação pronominal. O item exige conhecer a regra da norma-padrão e também avaliar a adequação da escolha ao contexto. Por isso é de nível 4: a gramática aparece como construção de sentido, e não como “certo/errado” (distrator B).</w:t>
+        <w:t xml:space="preserve"> O relatório indica que o anúncio foi usado para avaliar formalidade/informalidade e colocação pronominal. O item exige conhecer a regra e avaliar a adequação ao contexto (gramática como construção de sentido, nível 4), e não julgar como “certo/errado” (distrator B).</w:t>
       </w:r>
     </w:p>
     <w:p>
@@ -6891,7 +6931,7 @@
           <w:sz w:val="20"/>
           <w:szCs w:val="20"/>
         </w:rPr>
-        <w:t xml:space="preserve"> O relatório situa a intertextualidade entre poemas e canções nos níveis 3 e 4. Aqui a retomada é explícita (“Disse o poeta de outrora”), mas o estudante precisa reconhecer a paráfrase (“Minha escola tem varais”) e seu efeito de exaltação.</w:t>
+        <w:t xml:space="preserve"> A intertextualidade é explícita (Machado, Bentinho, Capitu, “olhos de ressaca”), mas o item exige reconhecer como o cordel reelabora um traço central do romance: o narrador suspeito e a ambiguidade.</w:t>
       </w:r>
     </w:p>
     <w:p>
@@ -6916,7 +6956,7 @@
           <w:sz w:val="19"/>
           <w:szCs w:val="19"/>
         </w:rPr>
-        <w:t xml:space="preserve">   Resposta: B   |   Nível 3   |   EF.6a9.LP.6.35</w:t>
+        <w:t xml:space="preserve">   Resposta: D   |   Nível 3   |   EF.6a9.LP.6.35</w:t>
       </w:r>
     </w:p>
     <w:p>
@@ -6961,7 +7001,7 @@
           <w:sz w:val="20"/>
           <w:szCs w:val="20"/>
         </w:rPr>
-        <w:t xml:space="preserve"> Exige reconhecer a variação linguística e seu efeito no gênero (rima com “cultura/amargura”, identidade popular do cordel), e não apenas apontar um “erro”. O distrator E confunde a concordância do verbo com “a gente” com a do substantivo.</w:t>
+        <w:t xml:space="preserve"> Exige reconhecer a variação linguística e seu efeito no gênero, e não apenas apontar “erro” (distrator A). O cordel é tradicionalmente ligado à oralidade e à cultura popular.</w:t>
       </w:r>
     </w:p>
     <w:p>
@@ -6986,7 +7026,7 @@
           <w:sz w:val="19"/>
           <w:szCs w:val="19"/>
         </w:rPr>
-        <w:t xml:space="preserve">   Resposta: A   |   Nível 3   |   EF.6a9.LP.1.05</w:t>
+        <w:t xml:space="preserve">   Resposta: B   |   Nível 2   |   EF.6a9.LP.1.05</w:t>
       </w:r>
     </w:p>
     <w:p>
@@ -7031,7 +7071,7 @@
           <w:sz w:val="20"/>
           <w:szCs w:val="20"/>
         </w:rPr>
-        <w:t xml:space="preserve"> A inferência do sentido figurado se confirma na estrofe seguinte (“Quem lê se enche de cultura, / Pois a rima mata a fome”). Os distratores B e C exploram outros traços possíveis de “pão”, sem apoio no texto.</w:t>
+        <w:t xml:space="preserve"> Metáfora de sentido acessível (pão = alimento essencial). O distrator D contradiz o texto (“nunca na vida / Tinha um livro folheado”).</w:t>
       </w:r>
     </w:p>
     <w:p>
@@ -7101,7 +7141,7 @@
           <w:sz w:val="20"/>
           <w:szCs w:val="20"/>
         </w:rPr>
-        <w:t xml:space="preserve"> Identificação de marcas evidentes de registro (“Gente”, “tipo”, reticências). O relatório indica que já no nível 1 o estudante identifica marcas de registro evidentes em textos do cotidiano.</w:t>
+        <w:t xml:space="preserve"> Identificação de marcas evidentes de oralidade (“Gente”, “tipo”, reticências). O relatório indica que já no nível 1 o estudante identifica marcas de registro evidentes.</w:t>
       </w:r>
     </w:p>
     <w:p>
@@ -7126,7 +7166,7 @@
           <w:sz w:val="19"/>
           <w:szCs w:val="19"/>
         </w:rPr>
-        <w:t xml:space="preserve">   Resposta: B   |   Nível 2   |   EF.6a9.LP.3.23</w:t>
+        <w:t xml:space="preserve">   Resposta: C   |   Nível 2   |   EF.7a9.LP.6.36</w:t>
       </w:r>
     </w:p>
     <w:p>
@@ -7149,7 +7189,7 @@
           <w:sz w:val="20"/>
           <w:szCs w:val="20"/>
         </w:rPr>
-        <w:t xml:space="preserve"> Estabelecer relações de sentido em textos verbais e/ou multimodais da cultura digital.</w:t>
+        <w:t xml:space="preserve"> Identificar a estrutura e/ou sentido de uma palavra a partir de seus processos de formação em língua portuguesa.</w:t>
       </w:r>
     </w:p>
     <w:p>
@@ -7171,7 +7211,7 @@
           <w:sz w:val="20"/>
           <w:szCs w:val="20"/>
         </w:rPr>
-        <w:t xml:space="preserve"> Relação entre recursos sonoros e sentido em um gênero digital. O distrator D é uma inferência exagerada: o humor torna o tom leve, mas o tema é tratado como “sério”.</w:t>
+        <w:t xml:space="preserve"> Neologismo formado por derivação sufixal (substantivo → verbo). O próprio texto dá a pista (“pegou ‘sexta’ e transformou em verbo”). O distrator A é uma armadilha de segmentação.</w:t>
       </w:r>
     </w:p>
     <w:p>
@@ -7241,7 +7281,7 @@
           <w:sz w:val="20"/>
           <w:szCs w:val="20"/>
         </w:rPr>
-        <w:t xml:space="preserve"> Relação lógico-discursiva entre orações. O relatório associa ao nível 3 o reconhecimento funcional de conectores. A concessão costuma ser confundida com a adversativa e com a causa.</w:t>
+        <w:t xml:space="preserve"> Relação lógico-discursiva entre orações. A concessão costuma ser confundida com causa (A) e com adversativa.</w:t>
       </w:r>
     </w:p>
     <w:p>
@@ -7266,7 +7306,7 @@
           <w:sz w:val="19"/>
           <w:szCs w:val="19"/>
         </w:rPr>
-        <w:t xml:space="preserve">   Resposta: C   |   Nível 2   |   EF.7a9.LP.1.09</w:t>
+        <w:t xml:space="preserve">   Resposta: A   |   Nível 2   |   EF.7a9.LP.1.09</w:t>
       </w:r>
     </w:p>
     <w:p>
@@ -7311,7 +7351,7 @@
           <w:sz w:val="20"/>
           <w:szCs w:val="20"/>
         </w:rPr>
-        <w:t xml:space="preserve"> Identificação da tese em um texto do campo da vida pública. O distrator E inverte a ideia central (“não é favor: é justiça”); D toma uma das reivindicações pela tese.</w:t>
+        <w:t xml:space="preserve"> Identificação da tese em um texto do campo da vida pública. O distrator E inverte a ideia central (“não é favor: é justiça”).</w:t>
       </w:r>
     </w:p>
     <w:p>
@@ -7336,7 +7376,7 @@
           <w:sz w:val="19"/>
           <w:szCs w:val="19"/>
         </w:rPr>
-        <w:t xml:space="preserve">   Resposta: A   |   Nível 3   |   EF.6a9.LP.1.03</w:t>
+        <w:t xml:space="preserve">   Resposta: B   |   Nível 2   |   EF.6a9.LP.1.03</w:t>
       </w:r>
     </w:p>
     <w:p>
@@ -7381,7 +7421,7 @@
           <w:sz w:val="20"/>
           <w:szCs w:val="20"/>
         </w:rPr>
-        <w:t xml:space="preserve"> Os distratores descrevem gêneros vizinhos (reportagem, dissertação, carta de reclamação), o que obriga a distinguir com precisão a estrutura composicional do manifesto, tarefa associada pelo relatório ao nível 3.</w:t>
+        <w:t xml:space="preserve"> Os distratores descrevem gêneros vizinhos (notícia, dissertação, conto, carta de reclamação), o que obriga a distinguir a estrutura composicional do manifesto.</w:t>
       </w:r>
     </w:p>
     <w:p>
@@ -7451,7 +7491,7 @@
           <w:sz w:val="20"/>
           <w:szCs w:val="20"/>
         </w:rPr>
-        <w:t xml:space="preserve"> O relatório informa que o manifesto foi usado para avaliar impessoalização e modalizadores discursivos. O distrator A é a armadilha clássica de achar que impessoal é o mesmo que neutro; na verdade, a impessoalização dá à opinião o peso de uma verdade geral.</w:t>
+        <w:t xml:space="preserve"> O relatório informa que o manifesto foi usado para avaliar impessoalização e modalizadores. O distrator A é a armadilha de achar que impessoal é o mesmo que neutro; C contradiz o texto (não há especialista citado).</w:t>
       </w:r>
     </w:p>
     <w:p>
@@ -7476,7 +7516,7 @@
           <w:sz w:val="19"/>
           <w:szCs w:val="19"/>
         </w:rPr>
-        <w:t xml:space="preserve">   Resposta: B   |   Nível 3   |   EF.7a9.LP.6.45</w:t>
+        <w:t xml:space="preserve">   Resposta: C   |   Nível 3   |   EF.7a9.LP.6.45</w:t>
       </w:r>
     </w:p>
     <w:p>
@@ -7521,7 +7561,7 @@
           <w:sz w:val="20"/>
           <w:szCs w:val="20"/>
         </w:rPr>
-        <w:t xml:space="preserve"> Mesmo descritor e mesmo formato do item-modelo de nível 3 do relatório (“A expressão destacada contribui, principalmente, para…”): reconhecer o valor semântico do conector e seu papel na progressão argumentativa.</w:t>
+        <w:t xml:space="preserve"> Mesmo formato do item-modelo de nível 3 do relatório (“A expressão destacada contribui, principalmente, para…”). O relatório cita as conjunções condicionais e adversativas entre os objetos avaliados no 9º ano.</w:t>
       </w:r>
     </w:p>
     <w:p>
@@ -7591,7 +7631,7 @@
           <w:sz w:val="20"/>
           <w:szCs w:val="20"/>
         </w:rPr>
-        <w:t xml:space="preserve"> Exige perceber a intencionalidade do enunciador: concordar parcialmente é uma estratégia para fortalecer a refutação. O distrator C é a leitura de quem não percebe a progressão argumentativa (concessão seguida de “No entanto”).</w:t>
+        <w:t xml:space="preserve"> Exige perceber a intencionalidade do enunciador: concordar parcialmente fortalece a refutação. O distrator C é a leitura de quem não percebe a progressão argumentativa (concessão + “No entanto”).</w:t>
       </w:r>
     </w:p>
     <w:p>
@@ -7616,7 +7656,7 @@
           <w:sz w:val="19"/>
           <w:szCs w:val="19"/>
         </w:rPr>
-        <w:t xml:space="preserve">   Resposta: C   |   Nível 3   |   EF.7a9.LP.1.10</w:t>
+        <w:t xml:space="preserve">   Resposta: A   |   Nível 3   |   EF.7a9.LP.1.10</w:t>
       </w:r>
     </w:p>
     <w:p>
@@ -7661,7 +7701,7 @@
           <w:sz w:val="20"/>
           <w:szCs w:val="20"/>
         </w:rPr>
-        <w:t xml:space="preserve"> Avalia a validade dos argumentos, aspecto que o relatório destaca no campo da Leitura. Expressões como “todo mundo sabe” e “sempre” indicam generalização. O distrator A aceita a generalização como prova.</w:t>
+        <w:t xml:space="preserve"> Avalia a validade dos argumentos. Expressões como “ninguém”, “todo aluno”, “é óbvio” e “todo mundo sabe” indicam generalização. O distrator D confunde dado de pesquisa com argumento de autoridade.</w:t>
       </w:r>
     </w:p>
     <w:p>
@@ -7686,7 +7726,7 @@
           <w:sz w:val="19"/>
           <w:szCs w:val="19"/>
         </w:rPr>
-        <w:t xml:space="preserve">   Resposta: A   |   Nível 4   |   EF.09.LP.6.49</w:t>
+        <w:t xml:space="preserve">   Resposta: B   |   Nível 4   |   EF.09.LP.6.49</w:t>
       </w:r>
     </w:p>
     <w:p>
@@ -7731,7 +7771,7 @@
           <w:sz w:val="20"/>
           <w:szCs w:val="20"/>
         </w:rPr>
-        <w:t xml:space="preserve"> Todos os distratores trazem usos frequentes do registro coloquial (assistir o, preferir mais… do que, chegar em, obedecer as). Para acertar, o estudante precisa dominar a norma-padrão, e não apenas reconhecer o que “soa bem”. Esse é um traço do nível 4.</w:t>
+        <w:t xml:space="preserve"> Todos os distratores trazem usos frequentes do registro coloquial (assistir o, preferir mais… do que, chegar em, obedecer as). Para acertar, é preciso dominar a norma-padrão, e não apenas reconhecer o que “soa bem” (nível 4).</w:t>
       </w:r>
     </w:p>
     <w:p>
@@ -7756,7 +7796,7 @@
           <w:sz w:val="19"/>
           <w:szCs w:val="19"/>
         </w:rPr>
-        <w:t xml:space="preserve">   Resposta: B   |   Nível 1   |   EF.67e9.LP.1.08</w:t>
+        <w:t xml:space="preserve">   Resposta: C   |   Nível 1   |   EF.67e9.LP.1.08</w:t>
       </w:r>
     </w:p>
     <w:p>
@@ -7826,7 +7866,7 @@
           <w:sz w:val="19"/>
           <w:szCs w:val="19"/>
         </w:rPr>
-        <w:t xml:space="preserve">   Resposta: D   |   Nível 2   |   EF.7e9.LP.4.28</w:t>
+        <w:t xml:space="preserve">   Resposta: E   |   Nível 1   |   EF.7e9.LP.4.28</w:t>
       </w:r>
     </w:p>
     <w:p>
@@ -7871,7 +7911,7 @@
           <w:sz w:val="20"/>
           <w:szCs w:val="20"/>
         </w:rPr>
-        <w:t xml:space="preserve"> Estrutura e funcionamento do hipertexto em publicações digitais. O distrator B é uma inferência indevida: ter links não garante veracidade.</w:t>
+        <w:t xml:space="preserve"> Funcionamento do hipertexto em publicações digitais, com informação explícita. O distrator B é uma inferência indevida: ter links não garante veracidade.</w:t>
       </w:r>
     </w:p>
     <w:p>
@@ -7896,7 +7936,7 @@
           <w:sz w:val="19"/>
           <w:szCs w:val="19"/>
         </w:rPr>
-        <w:t xml:space="preserve">   Resposta: E   |   Nível 2   |   EF.6a9.LP.4.27</w:t>
+        <w:t xml:space="preserve">   Resposta: D   |   Nível 2   |   EF.6a9.LP.4.27</w:t>
       </w:r>
     </w:p>
     <w:p>
@@ -7941,7 +7981,7 @@
           <w:sz w:val="20"/>
           <w:szCs w:val="20"/>
         </w:rPr>
-        <w:t xml:space="preserve"> Articulação de semioses em texto multimodal. Corresponde ao foco do relatório no campo da Multimodalidade: como imagem, som e palavra se complementam.</w:t>
+        <w:t xml:space="preserve"> Articulação de semioses em texto multimodal, foco do relatório no campo da Multimodalidade: imagem, som e palavra se complementam.</w:t>
       </w:r>
     </w:p>
     <w:p>
@@ -7966,7 +8006,7 @@
           <w:sz w:val="19"/>
           <w:szCs w:val="19"/>
         </w:rPr>
-        <w:t xml:space="preserve">   Resposta: C   |   Nível 4   |   EF.6a9.LP.1.14</w:t>
+        <w:t xml:space="preserve">   Resposta: A   |   Nível 3   |   EF.6a9.LP.1.14</w:t>
       </w:r>
     </w:p>
     <w:p>
@@ -8011,7 +8051,7 @@
           <w:sz w:val="20"/>
           <w:szCs w:val="20"/>
         </w:rPr>
-        <w:t xml:space="preserve"> Todos os distratores têm algum atrativo (popularidade, aparência de reportagem, boa escrita, engajamento). O estudante precisa aplicar com autonomia vários critérios ao mesmo tempo (autoria, data, referências), o que corresponde à avaliação crítica de confiabilidade descrita no nível 4.</w:t>
+        <w:t xml:space="preserve"> Todos os distratores têm algum atrativo (popularidade, boa escrita, engajamento). O estudante precisa aplicar os três critérios do vlog ao mesmo tempo: autoria, data e origem das informações.</w:t>
       </w:r>
     </w:p>
     <w:p>
@@ -8338,7 +8378,7 @@
                 <w:sz w:val="19"/>
                 <w:szCs w:val="19"/>
               </w:rPr>
-              <w:t xml:space="preserve">2, 6, 7, 11, 17, 27</w:t>
+              <w:t xml:space="preserve">1, 7, 11, 17, 27, 28</w:t>
             </w:r>
           </w:p>
         </w:tc>
@@ -8490,7 +8530,7 @@
                 <w:sz w:val="19"/>
                 <w:szCs w:val="19"/>
               </w:rPr>
-              <w:t xml:space="preserve">1, 5, 8, 10, 12, 18, 20, 28, 29</w:t>
+              <w:t xml:space="preserve">4, 5, 6, 12, 16, 18, 20, 21, 29</w:t>
             </w:r>
           </w:p>
         </w:tc>
@@ -8642,7 +8682,7 @@
                 <w:sz w:val="19"/>
                 <w:szCs w:val="19"/>
               </w:rPr>
-              <w:t xml:space="preserve">4, 9, 14, 15, 16, 19, 21, 23, 25</w:t>
+              <w:t xml:space="preserve">3, 8, 10, 14, 15, 19, 23, 25, 30</w:t>
             </w:r>
           </w:p>
         </w:tc>
@@ -8794,7 +8834,7 @@
                 <w:sz w:val="19"/>
                 <w:szCs w:val="19"/>
               </w:rPr>
-              <w:t xml:space="preserve">3, 13, 22, 24, 26, 30</w:t>
+              <w:t xml:space="preserve">2, 9, 13, 22, 24, 26</w:t>
             </w:r>
           </w:p>
         </w:tc>
@@ -9119,6 +9159,790 @@
     </w:p>
     <w:p>
       <w:pPr>
+        <w:keepNext/>
+        <w:spacing w:after="120" w:before="280"/>
+      </w:pPr>
+      <w:r>
+        <w:rPr>
+          <w:b/>
+          <w:bCs/>
+          <w:color w:val="1F3B5C"/>
+          <w:sz w:val="24"/>
+          <w:szCs w:val="24"/>
+        </w:rPr>
+        <w:t xml:space="preserve">Textos de Machado de Assis utilizados</w:t>
+      </w:r>
+    </w:p>
+    <w:p>
+      <w:pPr>
+        <w:spacing w:after="120" w:before="0" w:line="276"/>
+        <w:jc w:val="both"/>
+      </w:pPr>
+      <w:r>
+        <w:t xml:space="preserve">Os trechos abaixo foram transcritos de edições de domínio público. </w:t>
+      </w:r>
+      <w:r>
+        <w:rPr>
+          <w:b/>
+          <w:bCs/>
+        </w:rPr>
+        <w:t xml:space="preserve">Antes de imprimir, confira cada fragmento com o texto disponível em https://machadodeassis.net</w:t>
+      </w:r>
+      <w:r>
+        <w:t xml:space="preserve">, pois pequenas diferenças de pontuação e ortografia podem ocorrer entre edições.</w:t>
+      </w:r>
+    </w:p>
+    <w:tbl>
+      <w:tblPr>
+        <w:tblW w:type="dxa" w:w="9638"/>
+        <w:tblBorders>
+          <w:top w:val="single" w:color="auto" w:sz="4"/>
+          <w:left w:val="single" w:color="auto" w:sz="4"/>
+          <w:bottom w:val="single" w:color="auto" w:sz="4"/>
+          <w:right w:val="single" w:color="auto" w:sz="4"/>
+          <w:insideH w:val="single" w:color="auto" w:sz="4"/>
+          <w:insideV w:val="single" w:color="auto" w:sz="4"/>
+        </w:tblBorders>
+      </w:tblPr>
+      <w:tblGrid>
+        <w:gridCol w:w="1200"/>
+        <w:gridCol w:w="8438"/>
+      </w:tblGrid>
+      <w:tr>
+        <w:trPr>
+          <w:cantSplit/>
+          <w:tblHeader/>
+        </w:trPr>
+        <w:tc>
+          <w:tcPr>
+            <w:tcW w:type="dxa" w:w="1200"/>
+            <w:tcBorders>
+              <w:top w:val="single" w:color="7F8C9A" w:sz="6"/>
+              <w:left w:val="single" w:color="7F8C9A" w:sz="6"/>
+              <w:bottom w:val="single" w:color="7F8C9A" w:sz="6"/>
+              <w:right w:val="single" w:color="7F8C9A" w:sz="6"/>
+            </w:tcBorders>
+            <w:shd w:fill="D9E2EC" w:color="auto" w:val="clear"/>
+            <w:tcMar>
+              <w:top w:type="dxa" w:w="60"/>
+              <w:left w:type="dxa" w:w="100"/>
+              <w:bottom w:type="dxa" w:w="60"/>
+              <w:right w:type="dxa" w:w="100"/>
+            </w:tcMar>
+          </w:tcPr>
+          <w:p>
+            <w:pPr>
+              <w:spacing w:after="0" w:before="0" w:line="276"/>
+              <w:jc w:val="left"/>
+            </w:pPr>
+            <w:r>
+              <w:rPr>
+                <w:b/>
+                <w:bCs/>
+                <w:sz w:val="19"/>
+                <w:szCs w:val="19"/>
+              </w:rPr>
+              <w:t xml:space="preserve">Questão</w:t>
+            </w:r>
+          </w:p>
+        </w:tc>
+        <w:tc>
+          <w:tcPr>
+            <w:tcW w:type="dxa" w:w="8438"/>
+            <w:tcBorders>
+              <w:top w:val="single" w:color="7F8C9A" w:sz="6"/>
+              <w:left w:val="single" w:color="7F8C9A" w:sz="6"/>
+              <w:bottom w:val="single" w:color="7F8C9A" w:sz="6"/>
+              <w:right w:val="single" w:color="7F8C9A" w:sz="6"/>
+            </w:tcBorders>
+            <w:shd w:fill="D9E2EC" w:color="auto" w:val="clear"/>
+            <w:tcMar>
+              <w:top w:type="dxa" w:w="60"/>
+              <w:left w:type="dxa" w:w="100"/>
+              <w:bottom w:type="dxa" w:w="60"/>
+              <w:right w:type="dxa" w:w="100"/>
+            </w:tcMar>
+          </w:tcPr>
+          <w:p>
+            <w:pPr>
+              <w:spacing w:after="0" w:before="0" w:line="276"/>
+              <w:jc w:val="left"/>
+            </w:pPr>
+            <w:r>
+              <w:rPr>
+                <w:b/>
+                <w:bCs/>
+                <w:sz w:val="19"/>
+                <w:szCs w:val="19"/>
+              </w:rPr>
+              <w:t xml:space="preserve">Obra</w:t>
+            </w:r>
+          </w:p>
+        </w:tc>
+      </w:tr>
+      <w:tr>
+        <w:trPr>
+          <w:cantSplit/>
+          <w:tblHeader w:val="false"/>
+        </w:trPr>
+        <w:tc>
+          <w:tcPr>
+            <w:tcW w:type="dxa" w:w="1200"/>
+            <w:tcBorders>
+              <w:top w:val="single" w:color="7F8C9A" w:sz="6"/>
+              <w:left w:val="single" w:color="7F8C9A" w:sz="6"/>
+              <w:bottom w:val="single" w:color="7F8C9A" w:sz="6"/>
+              <w:right w:val="single" w:color="7F8C9A" w:sz="6"/>
+            </w:tcBorders>
+            <w:tcMar>
+              <w:top w:type="dxa" w:w="60"/>
+              <w:left w:type="dxa" w:w="100"/>
+              <w:bottom w:type="dxa" w:w="60"/>
+              <w:right w:type="dxa" w:w="100"/>
+            </w:tcMar>
+          </w:tcPr>
+          <w:p>
+            <w:pPr>
+              <w:spacing w:after="0" w:before="0" w:line="276"/>
+              <w:jc w:val="center"/>
+            </w:pPr>
+            <w:r>
+              <w:rPr>
+                <w:sz w:val="19"/>
+                <w:szCs w:val="19"/>
+              </w:rPr>
+              <w:t xml:space="preserve">1</w:t>
+            </w:r>
+          </w:p>
+        </w:tc>
+        <w:tc>
+          <w:tcPr>
+            <w:tcW w:type="dxa" w:w="8438"/>
+            <w:tcBorders>
+              <w:top w:val="single" w:color="7F8C9A" w:sz="6"/>
+              <w:left w:val="single" w:color="7F8C9A" w:sz="6"/>
+              <w:bottom w:val="single" w:color="7F8C9A" w:sz="6"/>
+              <w:right w:val="single" w:color="7F8C9A" w:sz="6"/>
+            </w:tcBorders>
+            <w:tcMar>
+              <w:top w:type="dxa" w:w="60"/>
+              <w:left w:type="dxa" w:w="100"/>
+              <w:bottom w:type="dxa" w:w="60"/>
+              <w:right w:type="dxa" w:w="100"/>
+            </w:tcMar>
+          </w:tcPr>
+          <w:p>
+            <w:pPr>
+              <w:spacing w:after="0" w:before="0" w:line="276"/>
+              <w:jc w:val="left"/>
+            </w:pPr>
+            <w:r>
+              <w:rPr>
+                <w:sz w:val="19"/>
+                <w:szCs w:val="19"/>
+              </w:rPr>
+              <w:t xml:space="preserve">O nascimento da crônica (História de quinze dias, 1877)</w:t>
+            </w:r>
+          </w:p>
+        </w:tc>
+      </w:tr>
+      <w:tr>
+        <w:trPr>
+          <w:cantSplit/>
+          <w:tblHeader w:val="false"/>
+        </w:trPr>
+        <w:tc>
+          <w:tcPr>
+            <w:tcW w:type="dxa" w:w="1200"/>
+            <w:tcBorders>
+              <w:top w:val="single" w:color="7F8C9A" w:sz="6"/>
+              <w:left w:val="single" w:color="7F8C9A" w:sz="6"/>
+              <w:bottom w:val="single" w:color="7F8C9A" w:sz="6"/>
+              <w:right w:val="single" w:color="7F8C9A" w:sz="6"/>
+            </w:tcBorders>
+            <w:tcMar>
+              <w:top w:type="dxa" w:w="60"/>
+              <w:left w:type="dxa" w:w="100"/>
+              <w:bottom w:type="dxa" w:w="60"/>
+              <w:right w:type="dxa" w:w="100"/>
+            </w:tcMar>
+          </w:tcPr>
+          <w:p>
+            <w:pPr>
+              <w:spacing w:after="0" w:before="0" w:line="276"/>
+              <w:jc w:val="center"/>
+            </w:pPr>
+            <w:r>
+              <w:rPr>
+                <w:sz w:val="19"/>
+                <w:szCs w:val="19"/>
+              </w:rPr>
+              <w:t xml:space="preserve">2</w:t>
+            </w:r>
+          </w:p>
+        </w:tc>
+        <w:tc>
+          <w:tcPr>
+            <w:tcW w:type="dxa" w:w="8438"/>
+            <w:tcBorders>
+              <w:top w:val="single" w:color="7F8C9A" w:sz="6"/>
+              <w:left w:val="single" w:color="7F8C9A" w:sz="6"/>
+              <w:bottom w:val="single" w:color="7F8C9A" w:sz="6"/>
+              <w:right w:val="single" w:color="7F8C9A" w:sz="6"/>
+            </w:tcBorders>
+            <w:tcMar>
+              <w:top w:type="dxa" w:w="60"/>
+              <w:left w:type="dxa" w:w="100"/>
+              <w:bottom w:type="dxa" w:w="60"/>
+              <w:right w:type="dxa" w:w="100"/>
+            </w:tcMar>
+          </w:tcPr>
+          <w:p>
+            <w:pPr>
+              <w:spacing w:after="0" w:before="0" w:line="276"/>
+              <w:jc w:val="left"/>
+            </w:pPr>
+            <w:r>
+              <w:rPr>
+                <w:sz w:val="19"/>
+                <w:szCs w:val="19"/>
+              </w:rPr>
+              <w:t xml:space="preserve">Bons dias! (Gazeta de Notícias, 19/5/1888)</w:t>
+            </w:r>
+          </w:p>
+        </w:tc>
+      </w:tr>
+      <w:tr>
+        <w:trPr>
+          <w:cantSplit/>
+          <w:tblHeader w:val="false"/>
+        </w:trPr>
+        <w:tc>
+          <w:tcPr>
+            <w:tcW w:type="dxa" w:w="1200"/>
+            <w:tcBorders>
+              <w:top w:val="single" w:color="7F8C9A" w:sz="6"/>
+              <w:left w:val="single" w:color="7F8C9A" w:sz="6"/>
+              <w:bottom w:val="single" w:color="7F8C9A" w:sz="6"/>
+              <w:right w:val="single" w:color="7F8C9A" w:sz="6"/>
+            </w:tcBorders>
+            <w:tcMar>
+              <w:top w:type="dxa" w:w="60"/>
+              <w:left w:type="dxa" w:w="100"/>
+              <w:bottom w:type="dxa" w:w="60"/>
+              <w:right w:type="dxa" w:w="100"/>
+            </w:tcMar>
+          </w:tcPr>
+          <w:p>
+            <w:pPr>
+              <w:spacing w:after="0" w:before="0" w:line="276"/>
+              <w:jc w:val="center"/>
+            </w:pPr>
+            <w:r>
+              <w:rPr>
+                <w:sz w:val="19"/>
+                <w:szCs w:val="19"/>
+              </w:rPr>
+              <w:t xml:space="preserve">3</w:t>
+            </w:r>
+          </w:p>
+        </w:tc>
+        <w:tc>
+          <w:tcPr>
+            <w:tcW w:type="dxa" w:w="8438"/>
+            <w:tcBorders>
+              <w:top w:val="single" w:color="7F8C9A" w:sz="6"/>
+              <w:left w:val="single" w:color="7F8C9A" w:sz="6"/>
+              <w:bottom w:val="single" w:color="7F8C9A" w:sz="6"/>
+              <w:right w:val="single" w:color="7F8C9A" w:sz="6"/>
+            </w:tcBorders>
+            <w:tcMar>
+              <w:top w:type="dxa" w:w="60"/>
+              <w:left w:type="dxa" w:w="100"/>
+              <w:bottom w:type="dxa" w:w="60"/>
+              <w:right w:type="dxa" w:w="100"/>
+            </w:tcMar>
+          </w:tcPr>
+          <w:p>
+            <w:pPr>
+              <w:spacing w:after="0" w:before="0" w:line="276"/>
+              <w:jc w:val="left"/>
+            </w:pPr>
+            <w:r>
+              <w:rPr>
+                <w:sz w:val="19"/>
+                <w:szCs w:val="19"/>
+              </w:rPr>
+              <w:t xml:space="preserve">Instinto de nacionalidade (O Novo Mundo, 1873)</w:t>
+            </w:r>
+          </w:p>
+        </w:tc>
+      </w:tr>
+      <w:tr>
+        <w:trPr>
+          <w:cantSplit/>
+          <w:tblHeader w:val="false"/>
+        </w:trPr>
+        <w:tc>
+          <w:tcPr>
+            <w:tcW w:type="dxa" w:w="1200"/>
+            <w:tcBorders>
+              <w:top w:val="single" w:color="7F8C9A" w:sz="6"/>
+              <w:left w:val="single" w:color="7F8C9A" w:sz="6"/>
+              <w:bottom w:val="single" w:color="7F8C9A" w:sz="6"/>
+              <w:right w:val="single" w:color="7F8C9A" w:sz="6"/>
+            </w:tcBorders>
+            <w:tcMar>
+              <w:top w:type="dxa" w:w="60"/>
+              <w:left w:type="dxa" w:w="100"/>
+              <w:bottom w:type="dxa" w:w="60"/>
+              <w:right w:type="dxa" w:w="100"/>
+            </w:tcMar>
+          </w:tcPr>
+          <w:p>
+            <w:pPr>
+              <w:spacing w:after="0" w:before="0" w:line="276"/>
+              <w:jc w:val="center"/>
+            </w:pPr>
+            <w:r>
+              <w:rPr>
+                <w:sz w:val="19"/>
+                <w:szCs w:val="19"/>
+              </w:rPr>
+              <w:t xml:space="preserve">4</w:t>
+            </w:r>
+          </w:p>
+        </w:tc>
+        <w:tc>
+          <w:tcPr>
+            <w:tcW w:type="dxa" w:w="8438"/>
+            <w:tcBorders>
+              <w:top w:val="single" w:color="7F8C9A" w:sz="6"/>
+              <w:left w:val="single" w:color="7F8C9A" w:sz="6"/>
+              <w:bottom w:val="single" w:color="7F8C9A" w:sz="6"/>
+              <w:right w:val="single" w:color="7F8C9A" w:sz="6"/>
+            </w:tcBorders>
+            <w:tcMar>
+              <w:top w:type="dxa" w:w="60"/>
+              <w:left w:type="dxa" w:w="100"/>
+              <w:bottom w:type="dxa" w:w="60"/>
+              <w:right w:type="dxa" w:w="100"/>
+            </w:tcMar>
+          </w:tcPr>
+          <w:p>
+            <w:pPr>
+              <w:spacing w:after="0" w:before="0" w:line="276"/>
+              <w:jc w:val="left"/>
+            </w:pPr>
+            <w:r>
+              <w:rPr>
+                <w:sz w:val="19"/>
+                <w:szCs w:val="19"/>
+              </w:rPr>
+              <w:t xml:space="preserve">Círculo vicioso (Ocidentais)</w:t>
+            </w:r>
+          </w:p>
+        </w:tc>
+      </w:tr>
+      <w:tr>
+        <w:trPr>
+          <w:cantSplit/>
+          <w:tblHeader w:val="false"/>
+        </w:trPr>
+        <w:tc>
+          <w:tcPr>
+            <w:tcW w:type="dxa" w:w="1200"/>
+            <w:tcBorders>
+              <w:top w:val="single" w:color="7F8C9A" w:sz="6"/>
+              <w:left w:val="single" w:color="7F8C9A" w:sz="6"/>
+              <w:bottom w:val="single" w:color="7F8C9A" w:sz="6"/>
+              <w:right w:val="single" w:color="7F8C9A" w:sz="6"/>
+            </w:tcBorders>
+            <w:tcMar>
+              <w:top w:type="dxa" w:w="60"/>
+              <w:left w:type="dxa" w:w="100"/>
+              <w:bottom w:type="dxa" w:w="60"/>
+              <w:right w:type="dxa" w:w="100"/>
+            </w:tcMar>
+          </w:tcPr>
+          <w:p>
+            <w:pPr>
+              <w:spacing w:after="0" w:before="0" w:line="276"/>
+              <w:jc w:val="center"/>
+            </w:pPr>
+            <w:r>
+              <w:rPr>
+                <w:sz w:val="19"/>
+                <w:szCs w:val="19"/>
+              </w:rPr>
+              <w:t xml:space="preserve">5</w:t>
+            </w:r>
+          </w:p>
+        </w:tc>
+        <w:tc>
+          <w:tcPr>
+            <w:tcW w:type="dxa" w:w="8438"/>
+            <w:tcBorders>
+              <w:top w:val="single" w:color="7F8C9A" w:sz="6"/>
+              <w:left w:val="single" w:color="7F8C9A" w:sz="6"/>
+              <w:bottom w:val="single" w:color="7F8C9A" w:sz="6"/>
+              <w:right w:val="single" w:color="7F8C9A" w:sz="6"/>
+            </w:tcBorders>
+            <w:tcMar>
+              <w:top w:type="dxa" w:w="60"/>
+              <w:left w:type="dxa" w:w="100"/>
+              <w:bottom w:type="dxa" w:w="60"/>
+              <w:right w:type="dxa" w:w="100"/>
+            </w:tcMar>
+          </w:tcPr>
+          <w:p>
+            <w:pPr>
+              <w:spacing w:after="0" w:before="0" w:line="276"/>
+              <w:jc w:val="left"/>
+            </w:pPr>
+            <w:r>
+              <w:rPr>
+                <w:sz w:val="19"/>
+                <w:szCs w:val="19"/>
+              </w:rPr>
+              <w:t xml:space="preserve">A Carolina (Relíquias de casa velha, 1906)</w:t>
+            </w:r>
+          </w:p>
+        </w:tc>
+      </w:tr>
+      <w:tr>
+        <w:trPr>
+          <w:cantSplit/>
+          <w:tblHeader w:val="false"/>
+        </w:trPr>
+        <w:tc>
+          <w:tcPr>
+            <w:tcW w:type="dxa" w:w="1200"/>
+            <w:tcBorders>
+              <w:top w:val="single" w:color="7F8C9A" w:sz="6"/>
+              <w:left w:val="single" w:color="7F8C9A" w:sz="6"/>
+              <w:bottom w:val="single" w:color="7F8C9A" w:sz="6"/>
+              <w:right w:val="single" w:color="7F8C9A" w:sz="6"/>
+            </w:tcBorders>
+            <w:tcMar>
+              <w:top w:type="dxa" w:w="60"/>
+              <w:left w:type="dxa" w:w="100"/>
+              <w:bottom w:type="dxa" w:w="60"/>
+              <w:right w:type="dxa" w:w="100"/>
+            </w:tcMar>
+          </w:tcPr>
+          <w:p>
+            <w:pPr>
+              <w:spacing w:after="0" w:before="0" w:line="276"/>
+              <w:jc w:val="center"/>
+            </w:pPr>
+            <w:r>
+              <w:rPr>
+                <w:sz w:val="19"/>
+                <w:szCs w:val="19"/>
+              </w:rPr>
+              <w:t xml:space="preserve">6</w:t>
+            </w:r>
+          </w:p>
+        </w:tc>
+        <w:tc>
+          <w:tcPr>
+            <w:tcW w:type="dxa" w:w="8438"/>
+            <w:tcBorders>
+              <w:top w:val="single" w:color="7F8C9A" w:sz="6"/>
+              <w:left w:val="single" w:color="7F8C9A" w:sz="6"/>
+              <w:bottom w:val="single" w:color="7F8C9A" w:sz="6"/>
+              <w:right w:val="single" w:color="7F8C9A" w:sz="6"/>
+            </w:tcBorders>
+            <w:tcMar>
+              <w:top w:type="dxa" w:w="60"/>
+              <w:left w:type="dxa" w:w="100"/>
+              <w:bottom w:type="dxa" w:w="60"/>
+              <w:right w:type="dxa" w:w="100"/>
+            </w:tcMar>
+          </w:tcPr>
+          <w:p>
+            <w:pPr>
+              <w:spacing w:after="0" w:before="0" w:line="276"/>
+              <w:jc w:val="left"/>
+            </w:pPr>
+            <w:r>
+              <w:rPr>
+                <w:sz w:val="19"/>
+                <w:szCs w:val="19"/>
+              </w:rPr>
+              <w:t xml:space="preserve">Mosca azul (Ocidentais)</w:t>
+            </w:r>
+          </w:p>
+        </w:tc>
+      </w:tr>
+      <w:tr>
+        <w:trPr>
+          <w:cantSplit/>
+          <w:tblHeader w:val="false"/>
+        </w:trPr>
+        <w:tc>
+          <w:tcPr>
+            <w:tcW w:type="dxa" w:w="1200"/>
+            <w:tcBorders>
+              <w:top w:val="single" w:color="7F8C9A" w:sz="6"/>
+              <w:left w:val="single" w:color="7F8C9A" w:sz="6"/>
+              <w:bottom w:val="single" w:color="7F8C9A" w:sz="6"/>
+              <w:right w:val="single" w:color="7F8C9A" w:sz="6"/>
+            </w:tcBorders>
+            <w:tcMar>
+              <w:top w:type="dxa" w:w="60"/>
+              <w:left w:type="dxa" w:w="100"/>
+              <w:bottom w:type="dxa" w:w="60"/>
+              <w:right w:type="dxa" w:w="100"/>
+            </w:tcMar>
+          </w:tcPr>
+          <w:p>
+            <w:pPr>
+              <w:spacing w:after="0" w:before="0" w:line="276"/>
+              <w:jc w:val="center"/>
+            </w:pPr>
+            <w:r>
+              <w:rPr>
+                <w:sz w:val="19"/>
+                <w:szCs w:val="19"/>
+              </w:rPr>
+              <w:t xml:space="preserve">7</w:t>
+            </w:r>
+          </w:p>
+        </w:tc>
+        <w:tc>
+          <w:tcPr>
+            <w:tcW w:type="dxa" w:w="8438"/>
+            <w:tcBorders>
+              <w:top w:val="single" w:color="7F8C9A" w:sz="6"/>
+              <w:left w:val="single" w:color="7F8C9A" w:sz="6"/>
+              <w:bottom w:val="single" w:color="7F8C9A" w:sz="6"/>
+              <w:right w:val="single" w:color="7F8C9A" w:sz="6"/>
+            </w:tcBorders>
+            <w:tcMar>
+              <w:top w:type="dxa" w:w="60"/>
+              <w:left w:type="dxa" w:w="100"/>
+              <w:bottom w:type="dxa" w:w="60"/>
+              <w:right w:type="dxa" w:w="100"/>
+            </w:tcMar>
+          </w:tcPr>
+          <w:p>
+            <w:pPr>
+              <w:spacing w:after="0" w:before="0" w:line="276"/>
+              <w:jc w:val="left"/>
+            </w:pPr>
+            <w:r>
+              <w:rPr>
+                <w:sz w:val="19"/>
+                <w:szCs w:val="19"/>
+              </w:rPr>
+              <w:t xml:space="preserve">Missa do galo (Páginas recolhidas, 1899)</w:t>
+            </w:r>
+          </w:p>
+        </w:tc>
+      </w:tr>
+      <w:tr>
+        <w:trPr>
+          <w:cantSplit/>
+          <w:tblHeader w:val="false"/>
+        </w:trPr>
+        <w:tc>
+          <w:tcPr>
+            <w:tcW w:type="dxa" w:w="1200"/>
+            <w:tcBorders>
+              <w:top w:val="single" w:color="7F8C9A" w:sz="6"/>
+              <w:left w:val="single" w:color="7F8C9A" w:sz="6"/>
+              <w:bottom w:val="single" w:color="7F8C9A" w:sz="6"/>
+              <w:right w:val="single" w:color="7F8C9A" w:sz="6"/>
+            </w:tcBorders>
+            <w:tcMar>
+              <w:top w:type="dxa" w:w="60"/>
+              <w:left w:type="dxa" w:w="100"/>
+              <w:bottom w:type="dxa" w:w="60"/>
+              <w:right w:type="dxa" w:w="100"/>
+            </w:tcMar>
+          </w:tcPr>
+          <w:p>
+            <w:pPr>
+              <w:spacing w:after="0" w:before="0" w:line="276"/>
+              <w:jc w:val="center"/>
+            </w:pPr>
+            <w:r>
+              <w:rPr>
+                <w:sz w:val="19"/>
+                <w:szCs w:val="19"/>
+              </w:rPr>
+              <w:t xml:space="preserve">8</w:t>
+            </w:r>
+          </w:p>
+        </w:tc>
+        <w:tc>
+          <w:tcPr>
+            <w:tcW w:type="dxa" w:w="8438"/>
+            <w:tcBorders>
+              <w:top w:val="single" w:color="7F8C9A" w:sz="6"/>
+              <w:left w:val="single" w:color="7F8C9A" w:sz="6"/>
+              <w:bottom w:val="single" w:color="7F8C9A" w:sz="6"/>
+              <w:right w:val="single" w:color="7F8C9A" w:sz="6"/>
+            </w:tcBorders>
+            <w:tcMar>
+              <w:top w:type="dxa" w:w="60"/>
+              <w:left w:type="dxa" w:w="100"/>
+              <w:bottom w:type="dxa" w:w="60"/>
+              <w:right w:type="dxa" w:w="100"/>
+            </w:tcMar>
+          </w:tcPr>
+          <w:p>
+            <w:pPr>
+              <w:spacing w:after="0" w:before="0" w:line="276"/>
+              <w:jc w:val="left"/>
+            </w:pPr>
+            <w:r>
+              <w:rPr>
+                <w:sz w:val="19"/>
+                <w:szCs w:val="19"/>
+              </w:rPr>
+              <w:t xml:space="preserve">A cartomante (Várias histórias, 1896)</w:t>
+            </w:r>
+          </w:p>
+        </w:tc>
+      </w:tr>
+      <w:tr>
+        <w:trPr>
+          <w:cantSplit/>
+          <w:tblHeader w:val="false"/>
+        </w:trPr>
+        <w:tc>
+          <w:tcPr>
+            <w:tcW w:type="dxa" w:w="1200"/>
+            <w:tcBorders>
+              <w:top w:val="single" w:color="7F8C9A" w:sz="6"/>
+              <w:left w:val="single" w:color="7F8C9A" w:sz="6"/>
+              <w:bottom w:val="single" w:color="7F8C9A" w:sz="6"/>
+              <w:right w:val="single" w:color="7F8C9A" w:sz="6"/>
+            </w:tcBorders>
+            <w:tcMar>
+              <w:top w:type="dxa" w:w="60"/>
+              <w:left w:type="dxa" w:w="100"/>
+              <w:bottom w:type="dxa" w:w="60"/>
+              <w:right w:type="dxa" w:w="100"/>
+            </w:tcMar>
+          </w:tcPr>
+          <w:p>
+            <w:pPr>
+              <w:spacing w:after="0" w:before="0" w:line="276"/>
+              <w:jc w:val="center"/>
+            </w:pPr>
+            <w:r>
+              <w:rPr>
+                <w:sz w:val="19"/>
+                <w:szCs w:val="19"/>
+              </w:rPr>
+              <w:t xml:space="preserve">9</w:t>
+            </w:r>
+          </w:p>
+        </w:tc>
+        <w:tc>
+          <w:tcPr>
+            <w:tcW w:type="dxa" w:w="8438"/>
+            <w:tcBorders>
+              <w:top w:val="single" w:color="7F8C9A" w:sz="6"/>
+              <w:left w:val="single" w:color="7F8C9A" w:sz="6"/>
+              <w:bottom w:val="single" w:color="7F8C9A" w:sz="6"/>
+              <w:right w:val="single" w:color="7F8C9A" w:sz="6"/>
+            </w:tcBorders>
+            <w:tcMar>
+              <w:top w:type="dxa" w:w="60"/>
+              <w:left w:type="dxa" w:w="100"/>
+              <w:bottom w:type="dxa" w:w="60"/>
+              <w:right w:type="dxa" w:w="100"/>
+            </w:tcMar>
+          </w:tcPr>
+          <w:p>
+            <w:pPr>
+              <w:spacing w:after="0" w:before="0" w:line="276"/>
+              <w:jc w:val="left"/>
+            </w:pPr>
+            <w:r>
+              <w:rPr>
+                <w:sz w:val="19"/>
+                <w:szCs w:val="19"/>
+              </w:rPr>
+              <w:t xml:space="preserve">Pai contra mãe (Relíquias de casa velha, 1906)</w:t>
+            </w:r>
+          </w:p>
+        </w:tc>
+      </w:tr>
+      <w:tr>
+        <w:trPr>
+          <w:cantSplit/>
+          <w:tblHeader w:val="false"/>
+        </w:trPr>
+        <w:tc>
+          <w:tcPr>
+            <w:tcW w:type="dxa" w:w="1200"/>
+            <w:tcBorders>
+              <w:top w:val="single" w:color="7F8C9A" w:sz="6"/>
+              <w:left w:val="single" w:color="7F8C9A" w:sz="6"/>
+              <w:bottom w:val="single" w:color="7F8C9A" w:sz="6"/>
+              <w:right w:val="single" w:color="7F8C9A" w:sz="6"/>
+            </w:tcBorders>
+            <w:tcMar>
+              <w:top w:type="dxa" w:w="60"/>
+              <w:left w:type="dxa" w:w="100"/>
+              <w:bottom w:type="dxa" w:w="60"/>
+              <w:right w:type="dxa" w:w="100"/>
+            </w:tcMar>
+          </w:tcPr>
+          <w:p>
+            <w:pPr>
+              <w:spacing w:after="0" w:before="0" w:line="276"/>
+              <w:jc w:val="center"/>
+            </w:pPr>
+            <w:r>
+              <w:rPr>
+                <w:sz w:val="19"/>
+                <w:szCs w:val="19"/>
+              </w:rPr>
+              <w:t xml:space="preserve">10</w:t>
+            </w:r>
+          </w:p>
+        </w:tc>
+        <w:tc>
+          <w:tcPr>
+            <w:tcW w:type="dxa" w:w="8438"/>
+            <w:tcBorders>
+              <w:top w:val="single" w:color="7F8C9A" w:sz="6"/>
+              <w:left w:val="single" w:color="7F8C9A" w:sz="6"/>
+              <w:bottom w:val="single" w:color="7F8C9A" w:sz="6"/>
+              <w:right w:val="single" w:color="7F8C9A" w:sz="6"/>
+            </w:tcBorders>
+            <w:tcMar>
+              <w:top w:type="dxa" w:w="60"/>
+              <w:left w:type="dxa" w:w="100"/>
+              <w:bottom w:type="dxa" w:w="60"/>
+              <w:right w:type="dxa" w:w="100"/>
+            </w:tcMar>
+          </w:tcPr>
+          <w:p>
+            <w:pPr>
+              <w:spacing w:after="0" w:before="0" w:line="276"/>
+              <w:jc w:val="left"/>
+            </w:pPr>
+            <w:r>
+              <w:rPr>
+                <w:sz w:val="19"/>
+                <w:szCs w:val="19"/>
+              </w:rPr>
+              <w:t xml:space="preserve">Teoria do medalhão (Papéis avulsos, 1882)</w:t>
+            </w:r>
+          </w:p>
+        </w:tc>
+      </w:tr>
+    </w:tbl>
+    <w:p>
+      <w:pPr>
         <w:spacing w:after="120" w:before="0" w:line="276"/>
         <w:jc w:val="both"/>
       </w:pPr>
@@ -9136,7 +9960,7 @@
           <w:sz w:val="18"/>
           <w:szCs w:val="18"/>
         </w:rPr>
-        <w:t xml:space="preserve">Todos os textos deste simulado foram elaborados especialmente para fins didáticos; marcas, personagens e programas citados são fictícios. A “Canção do exílio”, de Gonçalves Dias (1843), está em domínio público.</w:t>
+        <w:t xml:space="preserve">Os textos de Machado de Assis (1839–1908) estão em domínio público. Os demais textos foram elaborados especialmente para fins didáticos; marcas, personagens, canais e programas citados são fictícios.</w:t>
       </w:r>
     </w:p>
     <w:p>

</xml_diff>

<commit_message>
Transcreve textos de Machado de Assis do machadodeassis.net
Substitui crônicas, ensaio e poemas (ausentes do site) por trechos de
romances e contos sobre música, e corrige os contos conforme o texto do
site, com referência completa e data de acesso.

Co-Authored-By: Claude Opus 5.5 <noreply@anthropic.com>
Claude-Session: https://claude.ai/code/session_01S4ktTAQobNJezjCaSQPnsq
</commit_message>
<xml_diff>
--- a/Material_Professor_LP_9ano.docx
+++ b/Material_Professor_LP_9ano.docx
@@ -164,7 +164,7 @@
         <w:t xml:space="preserve">Uma questão, um texto:</w:t>
       </w:r>
       <w:r>
-        <w:t xml:space="preserve"> cada uma das 30 questões traz um texto diferente. Nos capítulos 1 a 3 (crônica, poema e conto), os textos são de </w:t>
+        <w:t xml:space="preserve"> cada uma das 30 questões traz um texto diferente. Nos capítulos 1 a 3, os textos são de </w:t>
       </w:r>
       <w:r>
         <w:rPr>
@@ -174,7 +174,7 @@
         <w:t xml:space="preserve">Machado de Assis</w:t>
       </w:r>
       <w:r>
-        <w:t xml:space="preserve">, em domínio público; nos demais capítulos, os textos foram elaborados para fins didáticos, e vários dialogam com a obra de Machado (cordel sobre </w:t>
+        <w:t xml:space="preserve">, em domínio público, transcritos do site machadodeassis.net (trechos de romances e contos; o site não publica as crônicas e os poemas do autor); nos demais capítulos, os textos foram elaborados para fins didáticos, e vários dialogam com a obra de Machado (cordel sobre </w:t>
       </w:r>
       <w:r>
         <w:rPr>
@@ -1256,7 +1256,7 @@
                 <w:sz w:val="19"/>
                 <w:szCs w:val="19"/>
               </w:rPr>
-              <w:t xml:space="preserve">1. Vidas em português – Crônica</w:t>
+              <w:t xml:space="preserve">1. Vidas em português – Romance</w:t>
             </w:r>
           </w:p>
         </w:tc>
@@ -1419,7 +1419,7 @@
                 <w:sz w:val="19"/>
                 <w:szCs w:val="19"/>
               </w:rPr>
-              <w:t xml:space="preserve">1. Vidas em português – Crônica</w:t>
+              <w:t xml:space="preserve">1. Vidas em português – Romance</w:t>
             </w:r>
           </w:p>
         </w:tc>
@@ -1578,7 +1578,7 @@
                 <w:sz w:val="19"/>
                 <w:szCs w:val="19"/>
               </w:rPr>
-              <w:t xml:space="preserve">1. Vidas em português – Crônica</w:t>
+              <w:t xml:space="preserve">1. Vidas em português – Romance</w:t>
             </w:r>
           </w:p>
         </w:tc>
@@ -1741,7 +1741,7 @@
                 <w:sz w:val="19"/>
                 <w:szCs w:val="19"/>
               </w:rPr>
-              <w:t xml:space="preserve">2. Trilhas sonoras da vida – Poema</w:t>
+              <w:t xml:space="preserve">2. Trilhas sonoras da vida – Conto</w:t>
             </w:r>
           </w:p>
         </w:tc>
@@ -1900,7 +1900,7 @@
                 <w:sz w:val="19"/>
                 <w:szCs w:val="19"/>
               </w:rPr>
-              <w:t xml:space="preserve">2. Trilhas sonoras da vida – Poema</w:t>
+              <w:t xml:space="preserve">2. Trilhas sonoras da vida – Conto</w:t>
             </w:r>
           </w:p>
         </w:tc>
@@ -2063,7 +2063,7 @@
                 <w:sz w:val="19"/>
                 <w:szCs w:val="19"/>
               </w:rPr>
-              <w:t xml:space="preserve">2. Trilhas sonoras da vida – Poema</w:t>
+              <w:t xml:space="preserve">2. Trilhas sonoras da vida – Conto</w:t>
             </w:r>
           </w:p>
         </w:tc>
@@ -5999,7 +5999,7 @@
           <w:sz w:val="20"/>
           <w:szCs w:val="20"/>
         </w:rPr>
-        <w:t xml:space="preserve"> Identificar o tema, a finalidade e/ou o possível público-alvo de textos de diferentes gêneros.</w:t>
+        <w:t xml:space="preserve"> Reconhecer elementos narrativos que caracterizam textos de diferentes gêneros (tempo, espaço, personagens, foco narrativo, enredo).</w:t>
       </w:r>
     </w:p>
     <w:p>
@@ -6021,7 +6021,7 @@
           <w:sz w:val="20"/>
           <w:szCs w:val="20"/>
         </w:rPr>
-        <w:t xml:space="preserve"> A resposta está explícita: “Essas vizinhas [...] sentaram-se à porta, para debicar os sucessos do dia. [...] Eis a origem da crônica.” Os distratores retomam palavras do texto (sol, lua, febre amarela, Petrópolis, jantar) fora de contexto, armadilha típica para quem lê sem compreender.</w:t>
+        <w:t xml:space="preserve"> Informação explícita no primeiro parágrafo (“para quem a campa foi outro berço”) e confirmada em “Dito isto, expirei”. O distrator A corresponde a “autor defunto”, justamente o que o narrador nega; D contradiz o texto (“adotar diferente método”).</w:t>
       </w:r>
     </w:p>
     <w:p>
@@ -6091,7 +6091,7 @@
           <w:sz w:val="20"/>
           <w:szCs w:val="20"/>
         </w:rPr>
-        <w:t xml:space="preserve"> Item de nível 4: exige perceber a ironia e o contexto histórico. O narrador “alforria” Pancrácio apenas quando a lei já seria aprovada (“profeta depois do gato morto”), mantém o rapaz servindo por um ordenado e o agride, chamando isso de “efeitos da liberdade”. Os distratores A e B são leituras literais que não percebem a crítica.</w:t>
+        <w:t xml:space="preserve"> Item de nível 4: exige perceber a ironia. Brás Cubas lembra que “desancava” Prudêncio “sem compaixão” e, mesmo assim, vê no episódio “um miolo gaiato”. O distrator B é plausível, mas não há arrependimento no texto; D contradiz a cena (“perdoa-lhe”). Sugere-se contextualizar com a turma a linguagem de época presente no capítulo.</w:t>
       </w:r>
     </w:p>
     <w:p>
@@ -6139,7 +6139,7 @@
           <w:sz w:val="20"/>
           <w:szCs w:val="20"/>
         </w:rPr>
-        <w:t xml:space="preserve"> Identificar a tese, os argumentos e/ou os mecanismos de persuasão presentes em textos de diferentes gêneros.</w:t>
+        <w:t xml:space="preserve"> Inferir o sentido figurado ou literal de uma palavra ou expressão a partir de seu contexto de uso.</w:t>
       </w:r>
     </w:p>
     <w:p>
@@ -6161,7 +6161,7 @@
           <w:sz w:val="20"/>
           <w:szCs w:val="20"/>
         </w:rPr>
-        <w:t xml:space="preserve"> O estudante precisa identificar a tese a partir de uma linguagem do século XIX (“ganham direito de cidade” = passam a ser aceitas). O texto dialoga com o tema da variação linguística do capítulo. O distrator B inverte a tese (“Querer que a nossa pare no século de quinhentos, é um erro”).</w:t>
+        <w:t xml:space="preserve"> Relaciona o capítulo ao tema da variação linguística: o “vulgo” (o povo) atribui à palavra um sentido próprio. O distrator D ignora que “Dom veio por ironia”; E contradiz o texto (“Nem por isso me zanguei”).</w:t>
       </w:r>
     </w:p>
     <w:p>
@@ -6231,7 +6231,7 @@
           <w:sz w:val="20"/>
           <w:szCs w:val="20"/>
         </w:rPr>
-        <w:t xml:space="preserve"> A personificação permite que os seres “falem” e desejem. O título “Círculo vicioso” se explica pelo último verso, em que o sol quer ser vaga-lume, fechando o ciclo. O distrator C contradiz o texto (“Pesa-me esta brilhante auréola”).</w:t>
+        <w:t xml:space="preserve"> Comparação explícita (“Como... assim...”) que traduz o conflito do personagem: ter vocação, mas não conseguir compor. Os distratores A e D tomam a comparação em sentido literal.</w:t>
       </w:r>
     </w:p>
     <w:p>
@@ -6301,7 +6301,7 @@
           <w:sz w:val="20"/>
           <w:szCs w:val="20"/>
         </w:rPr>
-        <w:t xml:space="preserve"> Inferência de sentido figurado (eufemismo) apoiada no contexto: “Em que descansas dessa longa vida”, “flores”, “mortos nos deixa e separados”. O distrator A é a leitura literal de “leito”.</w:t>
+        <w:t xml:space="preserve"> Inferência do sentido figurado a partir de um campo semântico religioso (santos, igreja, altar, evangelho). O distrator B confunde Pestana com o padre que o educou.</w:t>
       </w:r>
     </w:p>
     <w:p>
@@ -6371,7 +6371,7 @@
           <w:sz w:val="20"/>
           <w:szCs w:val="20"/>
         </w:rPr>
-        <w:t xml:space="preserve"> Recurso expressivo (repetição e polissíndeto) relacionado ao sentido. O relatório aponta dificuldade no nível 1 em reconhecer efeitos de sentido de recursos expressivos.</w:t>
+        <w:t xml:space="preserve"> Recurso expressivo ligado ao título (“lá menor”). O distrator B confunde a nota musical “lá” com o advérbio de lugar. Isso exige atenção ao contexto.</w:t>
       </w:r>
     </w:p>
     <w:p>
@@ -6441,7 +6441,7 @@
           <w:sz w:val="20"/>
           <w:szCs w:val="20"/>
         </w:rPr>
-        <w:t xml:space="preserve"> Marcas de 1ª pessoa (“Nunca pude entender”, “contava eu dezessete”) e de tempo passado (“há muitos anos”) caracterizam o narrador-personagem que rememora. Item de nível 1: elemento básico da narrativa com apoio explícito.</w:t>
+        <w:t xml:space="preserve"> Marcas de 1ª pessoa (“Nunca pude entender”, “contava eu dezessete”) e de tempo passado (“há muitos anos”) caracterizam o narrador-personagem que rememora.</w:t>
       </w:r>
     </w:p>
     <w:p>
@@ -6511,7 +6511,7 @@
           <w:sz w:val="20"/>
           <w:szCs w:val="20"/>
         </w:rPr>
-        <w:t xml:space="preserve"> O relatório situa a intertextualidade nos níveis 3 e 4. O narrador declara a relação (“Era a mesma explicação que dava a bela Rita”), e o estudante precisa perceber sua função: antecipar o tema e dar autoridade à crença de Rita. O distrator D confunde a crença da personagem com uma verdade do texto.</w:t>
+        <w:t xml:space="preserve"> O narrador declara a relação (“Era a mesma explicação que dava a bela Rita”); o estudante precisa perceber sua função: antecipar o tema e dar autoridade à crença de Rita. O distrator D confunde a crença da personagem com uma verdade do texto.</w:t>
       </w:r>
     </w:p>
     <w:p>
@@ -6581,7 +6581,7 @@
           <w:sz w:val="20"/>
           <w:szCs w:val="20"/>
         </w:rPr>
-        <w:t xml:space="preserve"> Item de nível 4: exige perceber a ironia, ou seja, a distância entre o que o narrador diz e o que o texto denuncia. O distrator A é a leitura literal; B ignora a escolha de palavras (“grotesco”, “cruel”).</w:t>
+        <w:t xml:space="preserve"> Exige perceber a ironia: a distância entre o que o narrador diz e o que o texto denuncia. O distrator A é a leitura literal; B ignora a escolha de palavras (“grotesco”, “cruel”).</w:t>
       </w:r>
     </w:p>
     <w:p>
@@ -6651,7 +6651,7 @@
           <w:sz w:val="20"/>
           <w:szCs w:val="20"/>
         </w:rPr>
-        <w:t xml:space="preserve"> A transposição exige ajustar pessoa, tempo verbal (presente → pretérito imperfeito), modo (imperativo → subjuntivo) e incluir verbos de dizer. O distrator E troca quem fala, o que exige atenção aos travessões.</w:t>
+        <w:t xml:space="preserve"> A transposição exige ajustar pessoa, tempo verbal (presente → pretérito imperfeito), modo (imperativo → subjuntivo) e incluir verbos de dizer. O distrator E troca quem fala.</w:t>
       </w:r>
     </w:p>
     <w:p>
@@ -9179,17 +9179,17 @@
         <w:jc w:val="both"/>
       </w:pPr>
       <w:r>
-        <w:t xml:space="preserve">Os trechos abaixo foram transcritos de edições de domínio público. </w:t>
-      </w:r>
-      <w:r>
-        <w:rPr>
-          <w:b/>
-          <w:bCs/>
-        </w:rPr>
-        <w:t xml:space="preserve">Antes de imprimir, confira cada fragmento com o texto disponível em https://machadodeassis.net</w:t>
-      </w:r>
-      <w:r>
-        <w:t xml:space="preserve">, pois pequenas diferenças de pontuação e ortografia podem ocorrer entre edições.</w:t>
+        <w:t xml:space="preserve">Todos os trechos abaixo foram transcritos do site </w:t>
+      </w:r>
+      <w:r>
+        <w:rPr>
+          <w:b/>
+          <w:bCs/>
+        </w:rPr>
+        <w:t xml:space="preserve">https://machadodeassis.net</w:t>
+      </w:r>
+      <w:r>
+        <w:t xml:space="preserve"> (acesso em 7 out. 2026) e conferidos com ele, mantendo a grafia da edição usada pelo site (por exemplo, “cousa” e “dous”). Os cortes estão indicados por [...].</w:t>
       </w:r>
     </w:p>
     <w:tbl>
@@ -9341,7 +9341,7 @@
                 <w:sz w:val="19"/>
                 <w:szCs w:val="19"/>
               </w:rPr>
-              <w:t xml:space="preserve">O nascimento da crônica (História de quinze dias, 1877)</w:t>
+              <w:t xml:space="preserve">Memórias póstumas de Brás Cubas (1881), cap. I, “Óbito do autor”</w:t>
             </w:r>
           </w:p>
         </w:tc>
@@ -9407,7 +9407,7 @@
                 <w:sz w:val="19"/>
                 <w:szCs w:val="19"/>
               </w:rPr>
-              <w:t xml:space="preserve">Bons dias! (Gazeta de Notícias, 19/5/1888)</w:t>
+              <w:t xml:space="preserve">Memórias póstumas de Brás Cubas (1881), cap. LXVIII, “O vergalho”</w:t>
             </w:r>
           </w:p>
         </w:tc>
@@ -9473,7 +9473,7 @@
                 <w:sz w:val="19"/>
                 <w:szCs w:val="19"/>
               </w:rPr>
-              <w:t xml:space="preserve">Instinto de nacionalidade (O Novo Mundo, 1873)</w:t>
+              <w:t xml:space="preserve">Dom Casmurro (1899), cap. I, “Do título”</w:t>
             </w:r>
           </w:p>
         </w:tc>
@@ -9539,7 +9539,7 @@
                 <w:sz w:val="19"/>
                 <w:szCs w:val="19"/>
               </w:rPr>
-              <w:t xml:space="preserve">Círculo vicioso (Ocidentais)</w:t>
+              <w:t xml:space="preserve">“Cantiga de esponsais” (Histórias sem data, 1884)</w:t>
             </w:r>
           </w:p>
         </w:tc>
@@ -9605,7 +9605,7 @@
                 <w:sz w:val="19"/>
                 <w:szCs w:val="19"/>
               </w:rPr>
-              <w:t xml:space="preserve">A Carolina (Relíquias de casa velha, 1906)</w:t>
+              <w:t xml:space="preserve">“Um homem célebre” (Várias histórias, 1896)</w:t>
             </w:r>
           </w:p>
         </w:tc>
@@ -9671,7 +9671,7 @@
                 <w:sz w:val="19"/>
                 <w:szCs w:val="19"/>
               </w:rPr>
-              <w:t xml:space="preserve">Mosca azul (Ocidentais)</w:t>
+              <w:t xml:space="preserve">“Trio em lá menor” (Várias histórias, 1896)</w:t>
             </w:r>
           </w:p>
         </w:tc>
@@ -9737,7 +9737,7 @@
                 <w:sz w:val="19"/>
                 <w:szCs w:val="19"/>
               </w:rPr>
-              <w:t xml:space="preserve">Missa do galo (Páginas recolhidas, 1899)</w:t>
+              <w:t xml:space="preserve">“Missa do galo” (Páginas recolhidas, 1899)</w:t>
             </w:r>
           </w:p>
         </w:tc>
@@ -9803,7 +9803,7 @@
                 <w:sz w:val="19"/>
                 <w:szCs w:val="19"/>
               </w:rPr>
-              <w:t xml:space="preserve">A cartomante (Várias histórias, 1896)</w:t>
+              <w:t xml:space="preserve">“A cartomante” (Várias histórias, 1896)</w:t>
             </w:r>
           </w:p>
         </w:tc>
@@ -9869,7 +9869,7 @@
                 <w:sz w:val="19"/>
                 <w:szCs w:val="19"/>
               </w:rPr>
-              <w:t xml:space="preserve">Pai contra mãe (Relíquias de casa velha, 1906)</w:t>
+              <w:t xml:space="preserve">“Pai contra mãe” (Relíquias de casa velha, 1906)</w:t>
             </w:r>
           </w:p>
         </w:tc>
@@ -9935,7 +9935,7 @@
                 <w:sz w:val="19"/>
                 <w:szCs w:val="19"/>
               </w:rPr>
-              <w:t xml:space="preserve">Teoria do medalhão (Papéis avulsos, 1882)</w:t>
+              <w:t xml:space="preserve">“Teoria do medalhão” (Papéis avulsos, 1882)</w:t>
             </w:r>
           </w:p>
         </w:tc>

</xml_diff>

<commit_message>
Atualiza material do professor com as questões 12 e 29
Co-Authored-By: Claude Opus 5.5 <noreply@anthropic.com>
Claude-Session: https://claude.ai/code/session_01S4ktTAQobNJezjCaSQPnsq
</commit_message>
<xml_diff>
--- a/Material_Professor_LP_9ano.docx
+++ b/Material_Professor_LP_9ano.docx
@@ -5734,7 +5734,7 @@
                 <w:sz w:val="19"/>
                 <w:szCs w:val="19"/>
               </w:rPr>
-              <w:t xml:space="preserve">EF.6a9.LP.4.27</w:t>
+              <w:t xml:space="preserve">EF.6a9.LP.4.26</w:t>
             </w:r>
           </w:p>
         </w:tc>
@@ -6791,7 +6791,7 @@
           <w:sz w:val="20"/>
           <w:szCs w:val="20"/>
         </w:rPr>
-        <w:t xml:space="preserve"> Corresponde ao item-modelo de nível 2 do relatório: integrar imagem e texto verbal para chegar ao sentido figurado (“mundo” = experiências). Os distratores fazem leituras literais da imagem do globo.</w:t>
+        <w:t xml:space="preserve"> Item de relação entre texto verbal e não verbal (item-modelo de nível 2 do relatório): é preciso articular a fala da professora, a expressão de pânico do aluno e o balão do chat. O distrator D inverte a crítica da charge.</w:t>
       </w:r>
     </w:p>
     <w:p>
@@ -7936,7 +7936,7 @@
           <w:sz w:val="19"/>
           <w:szCs w:val="19"/>
         </w:rPr>
-        <w:t xml:space="preserve">   Resposta: D   |   Nível 2   |   EF.6a9.LP.4.27</w:t>
+        <w:t xml:space="preserve">   Resposta: D   |   Nível 2   |   EF.6a9.LP.4.26</w:t>
       </w:r>
     </w:p>
     <w:p>
@@ -7959,7 +7959,7 @@
           <w:sz w:val="20"/>
           <w:szCs w:val="20"/>
         </w:rPr>
-        <w:t xml:space="preserve"> Estabelecer a relação entre textos verbais e não verbais.</w:t>
+        <w:t xml:space="preserve"> Estabelecer relações de sentido em textos verbais e/ou multimodais da cultura digital.</w:t>
       </w:r>
     </w:p>
     <w:p>
@@ -7981,7 +7981,7 @@
           <w:sz w:val="20"/>
           <w:szCs w:val="20"/>
         </w:rPr>
-        <w:t xml:space="preserve"> Articulação de semioses em texto multimodal, foco do relatório no campo da Multimodalidade: imagem, som e palavra se complementam.</w:t>
+        <w:t xml:space="preserve"> Inferência de efeito de sentido em prática da cultura digital, com apoio na intertextualidade. O distrator E inverte o sentido de “só dois likes”; A ignora a quebra de expectativa (“E no sétimo...”).</w:t>
       </w:r>
     </w:p>
     <w:p>
@@ -9960,7 +9960,7 @@
           <w:sz w:val="18"/>
           <w:szCs w:val="18"/>
         </w:rPr>
-        <w:t xml:space="preserve">Os textos de Machado de Assis (1839–1908) estão em domínio público. Os demais textos foram elaborados especialmente para fins didáticos; marcas, personagens, canais e programas citados são fictícios.</w:t>
+        <w:t xml:space="preserve">Os textos de Machado de Assis (1839–1908) estão em domínio público. As charges das questões 12 (Jean Galvão) e 29 (Adão Iturrusgarai) foram publicadas no site UM BRASIL e são reproduzidas para fins didáticos, com indicação de autoria e fonte (Lei 9.610/98, art. 46, III). Os demais textos foram elaborados especialmente para fins didáticos; marcas, personagens, canais e programas citados são fictícios.</w:t>
       </w:r>
     </w:p>
     <w:p>

</xml_diff>

<commit_message>
Atualiza material do professor: 10 charges e 20 textos
Co-Authored-By: Claude Opus 5.5 <noreply@anthropic.com>
Claude-Session: https://claude.ai/code/session_01S4ktTAQobNJezjCaSQPnsq
</commit_message>
<xml_diff>
--- a/Material_Professor_LP_9ano.docx
+++ b/Material_Professor_LP_9ano.docx
@@ -161,10 +161,30 @@
           <w:b/>
           <w:bCs/>
         </w:rPr>
+        <w:t xml:space="preserve">Charges reais:</w:t>
+      </w:r>
+      <w:r>
+        <w:t xml:space="preserve"> 10 das 30 questões usam charges do site UM BRASIL (Jean Galvão, Adão Iturrusgarai, Caco Galhardo e Alberto Benett), intercaladas com as 20 questões de texto, como na Avalia, que mescla tiras, charges e textos verbais.</w:t>
+      </w:r>
+    </w:p>
+    <w:p>
+      <w:pPr>
+        <w:spacing w:after="60" w:before="0" w:line="276"/>
+        <w:ind w:left="284"/>
+        <w:jc w:val="left"/>
+      </w:pPr>
+      <w:r>
+        <w:t xml:space="preserve">▪  </w:t>
+      </w:r>
+      <w:r>
+        <w:rPr>
+          <w:b/>
+          <w:bCs/>
+        </w:rPr>
         <w:t xml:space="preserve">Uma questão, um texto:</w:t>
       </w:r>
       <w:r>
-        <w:t xml:space="preserve"> cada uma das 30 questões traz um texto diferente. Nos capítulos 1 a 3, os textos são de </w:t>
+        <w:t xml:space="preserve"> cada uma das 30 questões traz um texto ou imagem diferente. Nos capítulos 1 a 3, os textos são de </w:t>
       </w:r>
       <w:r>
         <w:rPr>
@@ -1419,7 +1439,7 @@
                 <w:sz w:val="19"/>
                 <w:szCs w:val="19"/>
               </w:rPr>
-              <w:t xml:space="preserve">1. Vidas em português – Romance</w:t>
+              <w:t xml:space="preserve">1. Vidas em português – Charge (Adão Iturrusgarai)</w:t>
             </w:r>
           </w:p>
         </w:tc>
@@ -3029,7 +3049,7 @@
                 <w:sz w:val="19"/>
                 <w:szCs w:val="19"/>
               </w:rPr>
-              <w:t xml:space="preserve">4. A imagem que vendemos – Propaganda</w:t>
+              <w:t xml:space="preserve">4. A imagem que vendemos – Charge (Jean Galvão)</w:t>
             </w:r>
           </w:p>
         </w:tc>
@@ -3351,7 +3371,7 @@
                 <w:sz w:val="19"/>
                 <w:szCs w:val="19"/>
               </w:rPr>
-              <w:t xml:space="preserve">5. Varais de poesia: versos ao vento – Cordel</w:t>
+              <w:t xml:space="preserve">5. Varais de poesia: versos ao vento – Charge (Adão Iturrusgarai)</w:t>
             </w:r>
           </w:p>
         </w:tc>
@@ -3642,7 +3662,7 @@
                 <w:sz w:val="19"/>
                 <w:szCs w:val="19"/>
               </w:rPr>
-              <w:t xml:space="preserve">EF.6a9.LP.1.05</w:t>
+              <w:t xml:space="preserve">EF.6a9.LP.4.27</w:t>
             </w:r>
           </w:p>
         </w:tc>
@@ -3673,7 +3693,7 @@
                 <w:sz w:val="19"/>
                 <w:szCs w:val="19"/>
               </w:rPr>
-              <w:t xml:space="preserve">5. Varais de poesia: versos ao vento – Cordel</w:t>
+              <w:t xml:space="preserve">5. Varais de poesia: versos ao vento – Charge (Jean Galvão)</w:t>
             </w:r>
           </w:p>
         </w:tc>
@@ -4124,7 +4144,7 @@
                 <w:sz w:val="19"/>
                 <w:szCs w:val="19"/>
               </w:rPr>
-              <w:t xml:space="preserve">EF.7a9.LP.6.43</w:t>
+              <w:t xml:space="preserve">EF.6a9.LP.1.05</w:t>
             </w:r>
           </w:p>
         </w:tc>
@@ -4154,7 +4174,7 @@
                 <w:sz w:val="19"/>
                 <w:szCs w:val="19"/>
               </w:rPr>
-              <w:t xml:space="preserve">6. Microfone na mão e uma ideia na cabeça – Podcast</w:t>
+              <w:t xml:space="preserve">6. Microfone na mão e uma ideia na cabeça – Charge (Jean Galvão)</w:t>
             </w:r>
           </w:p>
         </w:tc>
@@ -4446,7 +4466,7 @@
                 <w:sz w:val="19"/>
                 <w:szCs w:val="19"/>
               </w:rPr>
-              <w:t xml:space="preserve">EF.6a9.LP.1.03</w:t>
+              <w:t xml:space="preserve">EF.6a9.LP.4.27</w:t>
             </w:r>
           </w:p>
         </w:tc>
@@ -4476,7 +4496,7 @@
                 <w:sz w:val="19"/>
                 <w:szCs w:val="19"/>
               </w:rPr>
-              <w:t xml:space="preserve">7. O texto como ato – Manifesto</w:t>
+              <w:t xml:space="preserve">7. O texto como ato – Charge (Caco Galhardo)</w:t>
             </w:r>
           </w:p>
         </w:tc>
@@ -4930,7 +4950,7 @@
                 <w:sz w:val="19"/>
                 <w:szCs w:val="19"/>
               </w:rPr>
-              <w:t xml:space="preserve">EF.7a9.LP.2.22</w:t>
+              <w:t xml:space="preserve">EF.6a9.LP.4.27</w:t>
             </w:r>
           </w:p>
         </w:tc>
@@ -4961,7 +4981,7 @@
                 <w:sz w:val="19"/>
                 <w:szCs w:val="19"/>
               </w:rPr>
-              <w:t xml:space="preserve">8. Histórias silenciadas, vozes resistentes – Debate</w:t>
+              <w:t xml:space="preserve">8. Histórias silenciadas, vozes resistentes – Charge (Jean Galvão)</w:t>
             </w:r>
           </w:p>
         </w:tc>
@@ -5090,7 +5110,7 @@
                 <w:sz w:val="19"/>
                 <w:szCs w:val="19"/>
               </w:rPr>
-              <w:t xml:space="preserve">EF.7a9.LP.1.10</w:t>
+              <w:t xml:space="preserve">EF.6a9.LP.4.27</w:t>
             </w:r>
           </w:p>
         </w:tc>
@@ -5120,7 +5140,7 @@
                 <w:sz w:val="19"/>
                 <w:szCs w:val="19"/>
               </w:rPr>
-              <w:t xml:space="preserve">8. Histórias silenciadas, vozes resistentes – Debate</w:t>
+              <w:t xml:space="preserve">8. Histórias silenciadas, vozes resistentes – Charge (Alberto Benett)</w:t>
             </w:r>
           </w:p>
         </w:tc>
@@ -5764,7 +5784,7 @@
                 <w:sz w:val="19"/>
                 <w:szCs w:val="19"/>
               </w:rPr>
-              <w:t xml:space="preserve">9. Ideias, sons, imagens – Vlog</w:t>
+              <w:t xml:space="preserve">9. Ideias, sons, imagens – Charge (Adão Iturrusgarai)</w:t>
             </w:r>
           </w:p>
         </w:tc>
@@ -5896,7 +5916,7 @@
                 <w:sz w:val="19"/>
                 <w:szCs w:val="19"/>
               </w:rPr>
-              <w:t xml:space="preserve">EF.6a9.LP.1.14</w:t>
+              <w:t xml:space="preserve">EF.6a9.LP.4.27</w:t>
             </w:r>
           </w:p>
         </w:tc>
@@ -5927,7 +5947,7 @@
                 <w:sz w:val="19"/>
                 <w:szCs w:val="19"/>
               </w:rPr>
-              <w:t xml:space="preserve">9. Ideias, sons, imagens – Vlog</w:t>
+              <w:t xml:space="preserve">9. Ideias, sons, imagens – Charge (Adão Iturrusgarai)</w:t>
             </w:r>
           </w:p>
         </w:tc>
@@ -6091,7 +6111,7 @@
           <w:sz w:val="20"/>
           <w:szCs w:val="20"/>
         </w:rPr>
-        <w:t xml:space="preserve"> Item de nível 4: exige perceber a ironia. Brás Cubas lembra que “desancava” Prudêncio “sem compaixão” e, mesmo assim, vê no episódio “um miolo gaiato”. O distrator B é plausível, mas não há arrependimento no texto; D contradiz a cena (“perdoa-lhe”). Sugere-se contextualizar com a turma a linguagem de época presente no capítulo.</w:t>
+        <w:t xml:space="preserve"> Ironia construída pela inclusão de um item “sério” numa lista de seres imaginários.</w:t>
       </w:r>
     </w:p>
     <w:p>
@@ -6931,7 +6951,7 @@
           <w:sz w:val="20"/>
           <w:szCs w:val="20"/>
         </w:rPr>
-        <w:t xml:space="preserve"> A intertextualidade é explícita (Machado, Bentinho, Capitu, “olhos de ressaca”), mas o item exige reconhecer como o cordel reelabora um traço central do romance: o narrador suspeito e a ambiguidade.</w:t>
+        <w:t xml:space="preserve"> A intertextualidade com o Gênesis e a figura do diabo dão às redes um sentido negativo.</w:t>
       </w:r>
     </w:p>
     <w:p>
@@ -7026,7 +7046,7 @@
           <w:sz w:val="19"/>
           <w:szCs w:val="19"/>
         </w:rPr>
-        <w:t xml:space="preserve">   Resposta: B   |   Nível 2   |   EF.6a9.LP.1.05</w:t>
+        <w:t xml:space="preserve">   Resposta: B   |   Nível 2   |   EF.6a9.LP.4.27</w:t>
       </w:r>
     </w:p>
     <w:p>
@@ -7049,7 +7069,7 @@
           <w:sz w:val="20"/>
           <w:szCs w:val="20"/>
         </w:rPr>
-        <w:t xml:space="preserve"> Inferir o sentido figurado ou literal de uma palavra ou expressão a partir de seu contexto de uso.</w:t>
+        <w:t xml:space="preserve"> Estabelecer a relação entre textos verbais e não verbais.</w:t>
       </w:r>
     </w:p>
     <w:p>
@@ -7071,7 +7091,7 @@
           <w:sz w:val="20"/>
           <w:szCs w:val="20"/>
         </w:rPr>
-        <w:t xml:space="preserve"> Metáfora de sentido acessível (pão = alimento essencial). O distrator D contradiz o texto (“nunca na vida / Tinha um livro folheado”).</w:t>
+        <w:t xml:space="preserve"> Metáfora visual: o coração (símbolo de amor) ressignifica o globo.</w:t>
       </w:r>
     </w:p>
     <w:p>
@@ -7236,7 +7256,7 @@
           <w:sz w:val="19"/>
           <w:szCs w:val="19"/>
         </w:rPr>
-        <w:t xml:space="preserve">   Resposta: E   |   Nível 3   |   EF.7a9.LP.6.43</w:t>
+        <w:t xml:space="preserve">   Resposta: E   |   Nível 3   |   EF.6a9.LP.1.05</w:t>
       </w:r>
     </w:p>
     <w:p>
@@ -7259,7 +7279,7 @@
           <w:sz w:val="20"/>
           <w:szCs w:val="20"/>
         </w:rPr>
-        <w:t xml:space="preserve"> Identificar relações lógico-discursivas entre orações em períodos compostos.</w:t>
+        <w:t xml:space="preserve"> Inferir o sentido figurado ou literal de uma palavra ou expressão a partir de seu contexto de uso.</w:t>
       </w:r>
     </w:p>
     <w:p>
@@ -7281,7 +7301,7 @@
           <w:sz w:val="20"/>
           <w:szCs w:val="20"/>
         </w:rPr>
-        <w:t xml:space="preserve"> Relação lógico-discursiva entre orações. A concessão costuma ser confundida com causa (A) e com adversativa.</w:t>
+        <w:t xml:space="preserve"> O mesmo enunciado muda de sentido conforme a imagem e a pontuação (aspas × reticências).</w:t>
       </w:r>
     </w:p>
     <w:p>
@@ -7376,7 +7396,7 @@
           <w:sz w:val="19"/>
           <w:szCs w:val="19"/>
         </w:rPr>
-        <w:t xml:space="preserve">   Resposta: B   |   Nível 2   |   EF.6a9.LP.1.03</w:t>
+        <w:t xml:space="preserve">   Resposta: B   |   Nível 2   |   EF.6a9.LP.4.27</w:t>
       </w:r>
     </w:p>
     <w:p>
@@ -7399,7 +7419,7 @@
           <w:sz w:val="20"/>
           <w:szCs w:val="20"/>
         </w:rPr>
-        <w:t xml:space="preserve"> Identificar características estruturais e/ou marcas linguísticas de textos do campo da vida pública.</w:t>
+        <w:t xml:space="preserve"> Estabelecer a relação entre textos verbais e não verbais.</w:t>
       </w:r>
     </w:p>
     <w:p>
@@ -7421,7 +7441,7 @@
           <w:sz w:val="20"/>
           <w:szCs w:val="20"/>
         </w:rPr>
-        <w:t xml:space="preserve"> Os distratores descrevem gêneros vizinhos (notícia, dissertação, conto, carta de reclamação), o que obriga a distinguir a estrutura composicional do manifesto.</w:t>
+        <w:t xml:space="preserve"> Quebra de expectativa entre personagem (robô) e fala (“Amo impresso”).</w:t>
       </w:r>
     </w:p>
     <w:p>
@@ -7586,7 +7606,7 @@
           <w:sz w:val="19"/>
           <w:szCs w:val="19"/>
         </w:rPr>
-        <w:t xml:space="preserve">   Resposta: E   |   Nível 4   |   EF.7a9.LP.2.22</w:t>
+        <w:t xml:space="preserve">   Resposta: E   |   Nível 4   |   EF.6a9.LP.4.27</w:t>
       </w:r>
     </w:p>
     <w:p>
@@ -7631,7 +7651,7 @@
           <w:sz w:val="20"/>
           <w:szCs w:val="20"/>
         </w:rPr>
-        <w:t xml:space="preserve"> Exige perceber a intencionalidade do enunciador: concordar parcialmente fortalece a refutação. O distrator C é a leitura de quem não percebe a progressão argumentativa (concessão + “No entanto”).</w:t>
+        <w:t xml:space="preserve"> A ironia só aparece na leitura integrada dos três quadros (anúncio → corte → mesa no toco).</w:t>
       </w:r>
     </w:p>
     <w:p>
@@ -7656,7 +7676,7 @@
           <w:sz w:val="19"/>
           <w:szCs w:val="19"/>
         </w:rPr>
-        <w:t xml:space="preserve">   Resposta: A   |   Nível 3   |   EF.7a9.LP.1.10</w:t>
+        <w:t xml:space="preserve">   Resposta: A   |   Nível 3   |   EF.6a9.LP.4.27</w:t>
       </w:r>
     </w:p>
     <w:p>
@@ -7679,7 +7699,7 @@
           <w:sz w:val="20"/>
           <w:szCs w:val="20"/>
         </w:rPr>
-        <w:t xml:space="preserve"> Identificar a tese, os argumentos e/ou os mecanismos de persuasão presentes em textos de diferentes gêneros.</w:t>
+        <w:t xml:space="preserve"> Estabelecer a relação entre textos verbais e não verbais.</w:t>
       </w:r>
     </w:p>
     <w:p>
@@ -7701,7 +7721,7 @@
           <w:sz w:val="20"/>
           <w:szCs w:val="20"/>
         </w:rPr>
-        <w:t xml:space="preserve"> Avalia a validade dos argumentos. Expressões como “ninguém”, “todo aluno”, “é óbvio” e “todo mundo sabe” indicam generalização. O distrator D confunde dado de pesquisa com argumento de autoridade.</w:t>
+        <w:t xml:space="preserve"> Sentido construído pela sequência: a prisão do bobo desmente a fala do rei.</w:t>
       </w:r>
     </w:p>
     <w:p>
@@ -8006,7 +8026,7 @@
           <w:sz w:val="19"/>
           <w:szCs w:val="19"/>
         </w:rPr>
-        <w:t xml:space="preserve">   Resposta: A   |   Nível 3   |   EF.6a9.LP.1.14</w:t>
+        <w:t xml:space="preserve">   Resposta: A   |   Nível 3   |   EF.6a9.LP.4.27</w:t>
       </w:r>
     </w:p>
     <w:p>
@@ -8029,7 +8049,7 @@
           <w:sz w:val="20"/>
           <w:szCs w:val="20"/>
         </w:rPr>
-        <w:t xml:space="preserve"> Reconhecer elementos que indicam presença ou ausência de confiabilidade em textos do campo jornalístico-midiático.</w:t>
+        <w:t xml:space="preserve"> Estabelecer a relação entre textos verbais e não verbais.</w:t>
       </w:r>
     </w:p>
     <w:p>
@@ -8051,7 +8071,7 @@
           <w:sz w:val="20"/>
           <w:szCs w:val="20"/>
         </w:rPr>
-        <w:t xml:space="preserve"> Todos os distratores têm algum atrativo (popularidade, boa escrita, engajamento). O estudante precisa aplicar os três critérios do vlog ao mesmo tempo: autoria, data e origem das informações.</w:t>
+        <w:t xml:space="preserve"> A plateia de “likes” substitui o povo; a fala sem complemento (“prometo!”) mostra o vazio da promessa.</w:t>
       </w:r>
     </w:p>
     <w:p>
@@ -9377,7 +9397,7 @@
                 <w:sz w:val="19"/>
                 <w:szCs w:val="19"/>
               </w:rPr>
-              <w:t xml:space="preserve">2</w:t>
+              <w:t xml:space="preserve">3</w:t>
             </w:r>
           </w:p>
         </w:tc>
@@ -9407,7 +9427,7 @@
                 <w:sz w:val="19"/>
                 <w:szCs w:val="19"/>
               </w:rPr>
-              <w:t xml:space="preserve">Memórias póstumas de Brás Cubas (1881), cap. LXVIII, “O vergalho”</w:t>
+              <w:t xml:space="preserve">Dom Casmurro (1899), cap. I, “Do título”</w:t>
             </w:r>
           </w:p>
         </w:tc>
@@ -9443,7 +9463,7 @@
                 <w:sz w:val="19"/>
                 <w:szCs w:val="19"/>
               </w:rPr>
-              <w:t xml:space="preserve">3</w:t>
+              <w:t xml:space="preserve">4</w:t>
             </w:r>
           </w:p>
         </w:tc>
@@ -9473,7 +9493,7 @@
                 <w:sz w:val="19"/>
                 <w:szCs w:val="19"/>
               </w:rPr>
-              <w:t xml:space="preserve">Dom Casmurro (1899), cap. I, “Do título”</w:t>
+              <w:t xml:space="preserve">“Cantiga de esponsais” (Histórias sem data, 1884)</w:t>
             </w:r>
           </w:p>
         </w:tc>
@@ -9509,7 +9529,7 @@
                 <w:sz w:val="19"/>
                 <w:szCs w:val="19"/>
               </w:rPr>
-              <w:t xml:space="preserve">4</w:t>
+              <w:t xml:space="preserve">5</w:t>
             </w:r>
           </w:p>
         </w:tc>
@@ -9539,7 +9559,7 @@
                 <w:sz w:val="19"/>
                 <w:szCs w:val="19"/>
               </w:rPr>
-              <w:t xml:space="preserve">“Cantiga de esponsais” (Histórias sem data, 1884)</w:t>
+              <w:t xml:space="preserve">“Um homem célebre” (Várias histórias, 1896)</w:t>
             </w:r>
           </w:p>
         </w:tc>
@@ -9575,7 +9595,7 @@
                 <w:sz w:val="19"/>
                 <w:szCs w:val="19"/>
               </w:rPr>
-              <w:t xml:space="preserve">5</w:t>
+              <w:t xml:space="preserve">6</w:t>
             </w:r>
           </w:p>
         </w:tc>
@@ -9605,7 +9625,7 @@
                 <w:sz w:val="19"/>
                 <w:szCs w:val="19"/>
               </w:rPr>
-              <w:t xml:space="preserve">“Um homem célebre” (Várias histórias, 1896)</w:t>
+              <w:t xml:space="preserve">“Trio em lá menor” (Várias histórias, 1896)</w:t>
             </w:r>
           </w:p>
         </w:tc>
@@ -9641,7 +9661,7 @@
                 <w:sz w:val="19"/>
                 <w:szCs w:val="19"/>
               </w:rPr>
-              <w:t xml:space="preserve">6</w:t>
+              <w:t xml:space="preserve">7</w:t>
             </w:r>
           </w:p>
         </w:tc>
@@ -9671,7 +9691,7 @@
                 <w:sz w:val="19"/>
                 <w:szCs w:val="19"/>
               </w:rPr>
-              <w:t xml:space="preserve">“Trio em lá menor” (Várias histórias, 1896)</w:t>
+              <w:t xml:space="preserve">“Missa do galo” (Páginas recolhidas, 1899)</w:t>
             </w:r>
           </w:p>
         </w:tc>
@@ -9707,7 +9727,7 @@
                 <w:sz w:val="19"/>
                 <w:szCs w:val="19"/>
               </w:rPr>
-              <w:t xml:space="preserve">7</w:t>
+              <w:t xml:space="preserve">8</w:t>
             </w:r>
           </w:p>
         </w:tc>
@@ -9737,7 +9757,7 @@
                 <w:sz w:val="19"/>
                 <w:szCs w:val="19"/>
               </w:rPr>
-              <w:t xml:space="preserve">“Missa do galo” (Páginas recolhidas, 1899)</w:t>
+              <w:t xml:space="preserve">“A cartomante” (Várias histórias, 1896)</w:t>
             </w:r>
           </w:p>
         </w:tc>
@@ -9773,7 +9793,7 @@
                 <w:sz w:val="19"/>
                 <w:szCs w:val="19"/>
               </w:rPr>
-              <w:t xml:space="preserve">8</w:t>
+              <w:t xml:space="preserve">9</w:t>
             </w:r>
           </w:p>
         </w:tc>
@@ -9803,7 +9823,7 @@
                 <w:sz w:val="19"/>
                 <w:szCs w:val="19"/>
               </w:rPr>
-              <w:t xml:space="preserve">“A cartomante” (Várias histórias, 1896)</w:t>
+              <w:t xml:space="preserve">“Pai contra mãe” (Relíquias de casa velha, 1906)</w:t>
             </w:r>
           </w:p>
         </w:tc>
@@ -9839,72 +9859,6 @@
                 <w:sz w:val="19"/>
                 <w:szCs w:val="19"/>
               </w:rPr>
-              <w:t xml:space="preserve">9</w:t>
-            </w:r>
-          </w:p>
-        </w:tc>
-        <w:tc>
-          <w:tcPr>
-            <w:tcW w:type="dxa" w:w="8438"/>
-            <w:tcBorders>
-              <w:top w:val="single" w:color="7F8C9A" w:sz="6"/>
-              <w:left w:val="single" w:color="7F8C9A" w:sz="6"/>
-              <w:bottom w:val="single" w:color="7F8C9A" w:sz="6"/>
-              <w:right w:val="single" w:color="7F8C9A" w:sz="6"/>
-            </w:tcBorders>
-            <w:tcMar>
-              <w:top w:type="dxa" w:w="60"/>
-              <w:left w:type="dxa" w:w="100"/>
-              <w:bottom w:type="dxa" w:w="60"/>
-              <w:right w:type="dxa" w:w="100"/>
-            </w:tcMar>
-          </w:tcPr>
-          <w:p>
-            <w:pPr>
-              <w:spacing w:after="0" w:before="0" w:line="276"/>
-              <w:jc w:val="left"/>
-            </w:pPr>
-            <w:r>
-              <w:rPr>
-                <w:sz w:val="19"/>
-                <w:szCs w:val="19"/>
-              </w:rPr>
-              <w:t xml:space="preserve">“Pai contra mãe” (Relíquias de casa velha, 1906)</w:t>
-            </w:r>
-          </w:p>
-        </w:tc>
-      </w:tr>
-      <w:tr>
-        <w:trPr>
-          <w:cantSplit/>
-          <w:tblHeader w:val="false"/>
-        </w:trPr>
-        <w:tc>
-          <w:tcPr>
-            <w:tcW w:type="dxa" w:w="1200"/>
-            <w:tcBorders>
-              <w:top w:val="single" w:color="7F8C9A" w:sz="6"/>
-              <w:left w:val="single" w:color="7F8C9A" w:sz="6"/>
-              <w:bottom w:val="single" w:color="7F8C9A" w:sz="6"/>
-              <w:right w:val="single" w:color="7F8C9A" w:sz="6"/>
-            </w:tcBorders>
-            <w:tcMar>
-              <w:top w:type="dxa" w:w="60"/>
-              <w:left w:type="dxa" w:w="100"/>
-              <w:bottom w:type="dxa" w:w="60"/>
-              <w:right w:type="dxa" w:w="100"/>
-            </w:tcMar>
-          </w:tcPr>
-          <w:p>
-            <w:pPr>
-              <w:spacing w:after="0" w:before="0" w:line="276"/>
-              <w:jc w:val="center"/>
-            </w:pPr>
-            <w:r>
-              <w:rPr>
-                <w:sz w:val="19"/>
-                <w:szCs w:val="19"/>
-              </w:rPr>
               <w:t xml:space="preserve">10</w:t>
             </w:r>
           </w:p>
@@ -9960,7 +9914,7 @@
           <w:sz w:val="18"/>
           <w:szCs w:val="18"/>
         </w:rPr>
-        <w:t xml:space="preserve">Os textos de Machado de Assis (1839–1908) estão em domínio público. As charges das questões 12 (Jean Galvão) e 29 (Adão Iturrusgarai) foram publicadas no site UM BRASIL e são reproduzidas para fins didáticos, com indicação de autoria e fonte (Lei 9.610/98, art. 46, III). Os demais textos foram elaborados especialmente para fins didáticos; marcas, personagens, canais e programas citados são fictícios.</w:t>
+        <w:t xml:space="preserve">Os textos de Machado de Assis (1839–1908) estão em domínio público. As charges (questões 2, 12, 14, 16, 19, 21, 24, 25, 29, 30) foram publicadas no site UM BRASIL e são reproduzidas para fins didáticos, com indicação de autoria e fonte (Lei 9.610/98, art. 46, III). Os demais textos foram elaborados especialmente para fins didáticos; marcas, personagens, canais e programas citados são fictícios.</w:t>
       </w:r>
     </w:p>
     <w:p>

</xml_diff>